<commit_message>
semi final modul P37
</commit_message>
<xml_diff>
--- a/writable/templates/template_p37.docx
+++ b/writable/templates/template_p37.docx
@@ -3,15 +3,14 @@
 <w:document xmlns:wpc="http://schemas.microsoft.com/office/word/2010/wordprocessingCanvas" xmlns:cx="http://schemas.microsoft.com/office/drawing/2014/chartex" xmlns:cx1="http://schemas.microsoft.com/office/drawing/2015/9/8/chartex" xmlns:cx2="http://schemas.microsoft.com/office/drawing/2015/10/21/chartex" xmlns:cx3="http://schemas.microsoft.com/office/drawing/2016/5/9/chartex" xmlns:cx4="http://schemas.microsoft.com/office/drawing/2016/5/10/chartex" xmlns:cx5="http://schemas.microsoft.com/office/drawing/2016/5/11/chartex" xmlns:cx6="http://schemas.microsoft.com/office/drawing/2016/5/12/chartex" xmlns:cx7="http://schemas.microsoft.com/office/drawing/2016/5/13/chartex" xmlns:cx8="http://schemas.microsoft.com/office/drawing/2016/5/14/chartex" xmlns:mc="http://schemas.openxmlformats.org/markup-compatibility/2006" xmlns:aink="http://schemas.microsoft.com/office/drawing/2016/ink" xmlns:am3d="http://schemas.microsoft.com/office/drawing/2017/model3d" xmlns:o="urn:schemas-microsoft-com:office:office" xmlns:r="http://schemas.openxmlformats.org/officeDocument/2006/relationships" xmlns:m="http://schemas.openxmlformats.org/officeDocument/2006/math" xmlns:v="urn:schemas-microsoft-com:vml" xmlns:wp14="http://schemas.microsoft.com/office/word/2010/wordprocessingDrawing" xmlns:wp="http://schemas.openxmlformats.org/drawingml/2006/wordprocessingDrawing" xmlns:w10="urn:schemas-microsoft-com:office:word" xmlns:w="http://schemas.openxmlformats.org/wordprocessingml/2006/main" xmlns:w14="http://schemas.microsoft.com/office/word/2010/wordml" xmlns:w15="http://schemas.microsoft.com/office/word/2012/wordml" xmlns:w16cid="http://schemas.microsoft.com/office/word/2016/wordml/cid" xmlns:w16se="http://schemas.microsoft.com/office/word/2015/wordml/symex" xmlns:wpg="http://schemas.microsoft.com/office/word/2010/wordprocessingGroup" xmlns:wpi="http://schemas.microsoft.com/office/word/2010/wordprocessingInk" xmlns:wne="http://schemas.microsoft.com/office/word/2006/wordml" xmlns:wps="http://schemas.microsoft.com/office/word/2010/wordprocessingShape" mc:Ignorable="w14 w15 w16se w16cid wp14">
   <w:body>
     <w:p>
-      <w:bookmarkStart w:id="0" w:name="_GoBack"/>
-      <w:bookmarkEnd w:id="0"/>
       <w:r>
         <w:rPr>
           <w:b/>
           <w:bCs/>
           <w:u w:val="single"/>
+          <w:lang w:val="en-US"/>
         </w:rPr>
-        <w:t xml:space="preserve">KEJAKSAAN NEGERI </w:t>
+        <w:t>$</w:t>
       </w:r>
       <w:r>
         <w:rPr>
@@ -20,7 +19,45 @@
           <w:u w:val="single"/>
           <w:lang w:val="en-US"/>
         </w:rPr>
-        <w:t>BOYOLALI</w:t>
+        <w:t>{</w:t>
+      </w:r>
+      <w:proofErr w:type="spellStart"/>
+      <w:r>
+        <w:rPr>
+          <w:b/>
+          <w:bCs/>
+          <w:u w:val="single"/>
+          <w:lang w:val="en-US"/>
+        </w:rPr>
+        <w:t>nama</w:t>
+      </w:r>
+      <w:r>
+        <w:rPr>
+          <w:b/>
+          <w:bCs/>
+          <w:u w:val="single"/>
+          <w:lang w:val="en-US"/>
+        </w:rPr>
+        <w:t>_i</w:t>
+      </w:r>
+      <w:r>
+        <w:rPr>
+          <w:b/>
+          <w:bCs/>
+          <w:u w:val="single"/>
+          <w:lang w:val="en-US"/>
+        </w:rPr>
+        <w:t>nstansi</w:t>
+      </w:r>
+      <w:proofErr w:type="spellEnd"/>
+      <w:r>
+        <w:rPr>
+          <w:b/>
+          <w:bCs/>
+          <w:u w:val="single"/>
+          <w:lang w:val="en-US"/>
+        </w:rPr>
+        <w:t>}</w:t>
       </w:r>
       <w:r>
         <w:tab/>
@@ -49,6 +86,11 @@
       <w:r>
         <w:tab/>
       </w:r>
+      <w:r>
+        <w:tab/>
+      </w:r>
+      <w:bookmarkStart w:id="0" w:name="_GoBack"/>
+      <w:bookmarkEnd w:id="0"/>
       <w:r>
         <w:rPr>
           <w:b/>
@@ -129,25 +171,262 @@
         <w:ind w:firstLine="900"/>
         <w:jc w:val="both"/>
       </w:pPr>
+      <w:proofErr w:type="spellStart"/>
       <w:r>
         <w:rPr>
           <w:lang w:val="en-US"/>
         </w:rPr>
-        <w:t xml:space="preserve">Untuk melaksanakan surat Penetapan Hakim Pengadilan Negeri BOYOLALI, sehubungan dengan perkara tindak Pidana </w:t>
+        <w:t>Untuk</w:t>
+      </w:r>
+      <w:proofErr w:type="spellEnd"/>
+      <w:r>
+        <w:rPr>
+          <w:lang w:val="en-US"/>
+        </w:rPr>
+        <w:t xml:space="preserve"> </w:t>
+      </w:r>
+      <w:proofErr w:type="spellStart"/>
+      <w:r>
+        <w:rPr>
+          <w:lang w:val="en-US"/>
+        </w:rPr>
+        <w:t>melaksanakan</w:t>
+      </w:r>
+      <w:proofErr w:type="spellEnd"/>
+      <w:r>
+        <w:rPr>
+          <w:lang w:val="en-US"/>
+        </w:rPr>
+        <w:t xml:space="preserve"> </w:t>
+      </w:r>
+      <w:proofErr w:type="spellStart"/>
+      <w:r>
+        <w:rPr>
+          <w:lang w:val="en-US"/>
+        </w:rPr>
+        <w:t>surat</w:t>
+      </w:r>
+      <w:proofErr w:type="spellEnd"/>
+      <w:r>
+        <w:rPr>
+          <w:lang w:val="en-US"/>
+        </w:rPr>
+        <w:t xml:space="preserve"> </w:t>
+      </w:r>
+      <w:proofErr w:type="spellStart"/>
+      <w:r>
+        <w:rPr>
+          <w:lang w:val="en-US"/>
+        </w:rPr>
+        <w:t>Penetapan</w:t>
+      </w:r>
+      <w:proofErr w:type="spellEnd"/>
+      <w:r>
+        <w:rPr>
+          <w:lang w:val="en-US"/>
+        </w:rPr>
+        <w:t xml:space="preserve"> Hakim </w:t>
+      </w:r>
+      <w:proofErr w:type="spellStart"/>
+      <w:r>
+        <w:rPr>
+          <w:lang w:val="en-US"/>
+        </w:rPr>
+        <w:t>Pengadilan</w:t>
+      </w:r>
+      <w:proofErr w:type="spellEnd"/>
+      <w:r>
+        <w:rPr>
+          <w:lang w:val="en-US"/>
+        </w:rPr>
+        <w:t xml:space="preserve"> Negeri BOYOLALI, </w:t>
+      </w:r>
+      <w:proofErr w:type="spellStart"/>
+      <w:r>
+        <w:rPr>
+          <w:lang w:val="en-US"/>
+        </w:rPr>
+        <w:t>sehubungan</w:t>
+      </w:r>
+      <w:proofErr w:type="spellEnd"/>
+      <w:r>
+        <w:rPr>
+          <w:lang w:val="en-US"/>
+        </w:rPr>
+        <w:t xml:space="preserve"> </w:t>
+      </w:r>
+      <w:proofErr w:type="spellStart"/>
+      <w:r>
+        <w:rPr>
+          <w:lang w:val="en-US"/>
+        </w:rPr>
+        <w:t>dengan</w:t>
+      </w:r>
+      <w:proofErr w:type="spellEnd"/>
+      <w:r>
+        <w:rPr>
+          <w:lang w:val="en-US"/>
+        </w:rPr>
+        <w:t xml:space="preserve"> </w:t>
+      </w:r>
+      <w:proofErr w:type="spellStart"/>
+      <w:r>
+        <w:rPr>
+          <w:lang w:val="en-US"/>
+        </w:rPr>
+        <w:t>perkara</w:t>
+      </w:r>
+      <w:proofErr w:type="spellEnd"/>
+      <w:r>
+        <w:rPr>
+          <w:lang w:val="en-US"/>
+        </w:rPr>
+        <w:t xml:space="preserve"> </w:t>
+      </w:r>
+      <w:proofErr w:type="spellStart"/>
+      <w:r>
+        <w:rPr>
+          <w:lang w:val="en-US"/>
+        </w:rPr>
+        <w:t>tindak</w:t>
+      </w:r>
+      <w:proofErr w:type="spellEnd"/>
+      <w:r>
+        <w:rPr>
+          <w:lang w:val="en-US"/>
+        </w:rPr>
+        <w:t xml:space="preserve"> </w:t>
+      </w:r>
+      <w:proofErr w:type="spellStart"/>
+      <w:r>
+        <w:rPr>
+          <w:b/>
+          <w:lang w:val="en-US"/>
+        </w:rPr>
+        <w:t>Pidana</w:t>
+      </w:r>
+      <w:proofErr w:type="spellEnd"/>
+      <w:r>
+        <w:rPr>
+          <w:b/>
+          <w:lang w:val="en-US"/>
+        </w:rPr>
+        <w:t xml:space="preserve"> </w:t>
       </w:r>
       <w:r>
         <w:rPr>
-          <w:u w:val="single"/>
+          <w:b/>
           <w:lang w:val="en-US"/>
         </w:rPr>
-        <w:t>${jenis_perkara}</w:t>
+        <w:t>${</w:t>
+      </w:r>
+      <w:proofErr w:type="spellStart"/>
+      <w:r>
+        <w:rPr>
+          <w:b/>
+          <w:lang w:val="en-US"/>
+        </w:rPr>
+        <w:t>jenis_perkara</w:t>
+      </w:r>
+      <w:proofErr w:type="spellEnd"/>
+      <w:r>
+        <w:rPr>
+          <w:b/>
+          <w:lang w:val="en-US"/>
+        </w:rPr>
+        <w:t>}</w:t>
+      </w:r>
+      <w:r>
+        <w:rPr>
+          <w:b/>
+          <w:lang w:val="en-US"/>
+        </w:rPr>
+        <w:t>,</w:t>
       </w:r>
       <w:r>
         <w:rPr>
           <w:lang w:val="en-US"/>
         </w:rPr>
-        <w:t>, dengan acara pemeriksaan biasa atas nama terdakwa</w:t>
+        <w:t xml:space="preserve"> </w:t>
       </w:r>
+      <w:proofErr w:type="spellStart"/>
+      <w:r>
+        <w:rPr>
+          <w:lang w:val="en-US"/>
+        </w:rPr>
+        <w:t>dengan</w:t>
+      </w:r>
+      <w:proofErr w:type="spellEnd"/>
+      <w:r>
+        <w:rPr>
+          <w:lang w:val="en-US"/>
+        </w:rPr>
+        <w:t xml:space="preserve"> acara </w:t>
+      </w:r>
+      <w:proofErr w:type="spellStart"/>
+      <w:r>
+        <w:rPr>
+          <w:lang w:val="en-US"/>
+        </w:rPr>
+        <w:t>pemeriksaan</w:t>
+      </w:r>
+      <w:proofErr w:type="spellEnd"/>
+      <w:r>
+        <w:rPr>
+          <w:lang w:val="en-US"/>
+        </w:rPr>
+        <w:t xml:space="preserve"> </w:t>
+      </w:r>
+      <w:proofErr w:type="spellStart"/>
+      <w:r>
+        <w:rPr>
+          <w:lang w:val="en-US"/>
+        </w:rPr>
+        <w:t>biasa</w:t>
+      </w:r>
+      <w:proofErr w:type="spellEnd"/>
+      <w:r>
+        <w:rPr>
+          <w:lang w:val="en-US"/>
+        </w:rPr>
+        <w:t xml:space="preserve"> </w:t>
+      </w:r>
+      <w:proofErr w:type="spellStart"/>
+      <w:r>
+        <w:rPr>
+          <w:lang w:val="en-US"/>
+        </w:rPr>
+        <w:t>atas</w:t>
+      </w:r>
+      <w:proofErr w:type="spellEnd"/>
+      <w:r>
+        <w:rPr>
+          <w:lang w:val="en-US"/>
+        </w:rPr>
+        <w:t xml:space="preserve"> </w:t>
+      </w:r>
+      <w:proofErr w:type="spellStart"/>
+      <w:r>
+        <w:rPr>
+          <w:lang w:val="en-US"/>
+        </w:rPr>
+        <w:t>nama</w:t>
+      </w:r>
+      <w:proofErr w:type="spellEnd"/>
+      <w:r>
+        <w:rPr>
+          <w:lang w:val="en-US"/>
+        </w:rPr>
+        <w:t xml:space="preserve"> </w:t>
+      </w:r>
+      <w:proofErr w:type="spellStart"/>
+      <w:r>
+        <w:rPr>
+          <w:lang w:val="en-US"/>
+        </w:rPr>
+        <w:t>terdakwa</w:t>
+      </w:r>
+      <w:proofErr w:type="spellEnd"/>
       <w:r>
         <w:rPr>
           <w:b/>
@@ -160,14 +439,36 @@
         <w:rPr>
           <w:b/>
           <w:bCs/>
-          <w:color w:val="FF0000"/>
+          <w:color w:val="000000"/>
+          <w:lang w:val="en-US"/>
         </w:rPr>
-        <w:t>(NAMA TERDAKWA)</w:t>
+        <w:t>${</w:t>
+      </w:r>
+      <w:proofErr w:type="spellStart"/>
+      <w:r>
+        <w:rPr>
+          <w:b/>
+          <w:bCs/>
+          <w:color w:val="000000"/>
+          <w:lang w:val="en-US"/>
+        </w:rPr>
+        <w:t>nama_terdakwa</w:t>
+      </w:r>
+      <w:proofErr w:type="spellEnd"/>
+      <w:r>
+        <w:rPr>
+          <w:b/>
+          <w:bCs/>
+          <w:color w:val="000000"/>
+          <w:lang w:val="en-US"/>
+        </w:rPr>
+        <w:t>}</w:t>
       </w:r>
       <w:r>
         <w:rPr>
           <w:b/>
           <w:bCs/>
+          <w:color w:val="000000"/>
         </w:rPr>
         <w:t xml:space="preserve"> Bin </w:t>
       </w:r>
@@ -175,23 +476,146 @@
         <w:rPr>
           <w:b/>
           <w:bCs/>
-          <w:color w:val="FF0000"/>
+          <w:color w:val="000000"/>
+          <w:lang w:val="en-US"/>
         </w:rPr>
-        <w:t>(ORANG TUA TERDAKWA)</w:t>
+        <w:t>$</w:t>
       </w:r>
       <w:r>
         <w:rPr>
           <w:b/>
           <w:bCs/>
+          <w:color w:val="000000"/>
           <w:lang w:val="en-US"/>
         </w:rPr>
-        <w:t xml:space="preserve">.  </w:t>
+        <w:t>{</w:t>
       </w:r>
+      <w:proofErr w:type="spellStart"/>
+      <w:r>
+        <w:rPr>
+          <w:b/>
+          <w:bCs/>
+          <w:color w:val="000000"/>
+          <w:lang w:val="en-US"/>
+        </w:rPr>
+        <w:t>nama_ortu</w:t>
+      </w:r>
+      <w:proofErr w:type="spellEnd"/>
+      <w:r>
+        <w:rPr>
+          <w:b/>
+          <w:bCs/>
+          <w:color w:val="000000"/>
+          <w:lang w:val="en-US"/>
+        </w:rPr>
+        <w:t>}</w:t>
+      </w:r>
+      <w:r>
+        <w:rPr>
+          <w:b/>
+          <w:bCs/>
+          <w:color w:val="FF0000"/>
+          <w:lang w:val="en-US"/>
+        </w:rPr>
+        <w:t xml:space="preserve"> </w:t>
+      </w:r>
+      <w:proofErr w:type="spellStart"/>
       <w:r>
         <w:rPr>
           <w:lang w:val="en-US"/>
         </w:rPr>
-        <w:t>Untuk keperluan persidangan diminta agar Saudara memberikan keterangan.</w:t>
+        <w:t>Untuk</w:t>
+      </w:r>
+      <w:proofErr w:type="spellEnd"/>
+      <w:r>
+        <w:rPr>
+          <w:lang w:val="en-US"/>
+        </w:rPr>
+        <w:t xml:space="preserve"> </w:t>
+      </w:r>
+      <w:proofErr w:type="spellStart"/>
+      <w:r>
+        <w:rPr>
+          <w:lang w:val="en-US"/>
+        </w:rPr>
+        <w:t>keperluan</w:t>
+      </w:r>
+      <w:proofErr w:type="spellEnd"/>
+      <w:r>
+        <w:rPr>
+          <w:lang w:val="en-US"/>
+        </w:rPr>
+        <w:t xml:space="preserve"> </w:t>
+      </w:r>
+      <w:proofErr w:type="spellStart"/>
+      <w:r>
+        <w:rPr>
+          <w:lang w:val="en-US"/>
+        </w:rPr>
+        <w:t>persidangan</w:t>
+      </w:r>
+      <w:proofErr w:type="spellEnd"/>
+      <w:r>
+        <w:rPr>
+          <w:lang w:val="en-US"/>
+        </w:rPr>
+        <w:t xml:space="preserve"> </w:t>
+      </w:r>
+      <w:proofErr w:type="spellStart"/>
+      <w:r>
+        <w:rPr>
+          <w:lang w:val="en-US"/>
+        </w:rPr>
+        <w:t>diminta</w:t>
+      </w:r>
+      <w:proofErr w:type="spellEnd"/>
+      <w:r>
+        <w:rPr>
+          <w:lang w:val="en-US"/>
+        </w:rPr>
+        <w:t xml:space="preserve"> agar </w:t>
+      </w:r>
+      <w:proofErr w:type="spellStart"/>
+      <w:r>
+        <w:rPr>
+          <w:lang w:val="en-US"/>
+        </w:rPr>
+        <w:t>Saudara</w:t>
+      </w:r>
+      <w:proofErr w:type="spellEnd"/>
+      <w:r>
+        <w:rPr>
+          <w:lang w:val="en-US"/>
+        </w:rPr>
+        <w:t xml:space="preserve"> </w:t>
+      </w:r>
+      <w:proofErr w:type="spellStart"/>
+      <w:r>
+        <w:rPr>
+          <w:lang w:val="en-US"/>
+        </w:rPr>
+        <w:t>memberikan</w:t>
+      </w:r>
+      <w:proofErr w:type="spellEnd"/>
+      <w:r>
+        <w:rPr>
+          <w:lang w:val="en-US"/>
+        </w:rPr>
+        <w:t xml:space="preserve"> </w:t>
+      </w:r>
+      <w:proofErr w:type="spellStart"/>
+      <w:r>
+        <w:rPr>
+          <w:lang w:val="en-US"/>
+        </w:rPr>
+        <w:t>keterangan</w:t>
+      </w:r>
+      <w:proofErr w:type="spellEnd"/>
+      <w:r>
+        <w:rPr>
+          <w:lang w:val="en-US"/>
+        </w:rPr>
+        <w:t>.</w:t>
       </w:r>
     </w:p>
     <w:p>
@@ -203,12 +627,11 @@
     <w:tbl>
       <w:tblPr>
         <w:tblW w:w="0" w:type="auto"/>
-        <w:tblInd w:w="0" w:type="dxa"/>
         <w:tblLook w:val="0000" w:firstRow="0" w:lastRow="0" w:firstColumn="0" w:lastColumn="0" w:noHBand="0" w:noVBand="0"/>
       </w:tblPr>
       <w:tblGrid>
         <w:gridCol w:w="3706"/>
-        <w:gridCol w:w="283"/>
+        <w:gridCol w:w="371"/>
         <w:gridCol w:w="6895"/>
       </w:tblGrid>
       <w:tr>
@@ -230,7 +653,7 @@
         </w:tc>
         <w:tc>
           <w:tcPr>
-            <w:tcW w:w="283" w:type="dxa"/>
+            <w:tcW w:w="371" w:type="dxa"/>
             <w:tcMar>
               <w:top w:w="0" w:type="dxa"/>
               <w:left w:w="108" w:type="dxa"/>
@@ -259,14 +682,19 @@
           </w:tcPr>
           <w:p>
             <w:r>
-              <w:t>${nama_</w:t>
+              <w:t>${</w:t>
             </w:r>
+            <w:proofErr w:type="spellStart"/>
             <w:r>
               <w:rPr>
+                <w:b/>
+                <w:bCs/>
+                <w:color w:val="000000"/>
                 <w:lang w:val="en-US"/>
               </w:rPr>
-              <w:t>lengkap</w:t>
+              <w:t>nama_terdakwa</w:t>
             </w:r>
+            <w:proofErr w:type="spellEnd"/>
             <w:r>
               <w:t>}</w:t>
             </w:r>
@@ -303,7 +731,7 @@
         </w:tc>
         <w:tc>
           <w:tcPr>
-            <w:tcW w:w="283" w:type="dxa"/>
+            <w:tcW w:w="371" w:type="dxa"/>
             <w:tcMar>
               <w:top w:w="0" w:type="dxa"/>
               <w:left w:w="108" w:type="dxa"/>
@@ -340,7 +768,21 @@
               <w:rPr>
                 <w:lang w:val="en-US"/>
               </w:rPr>
-              <w:t>${tempat_lahir}</w:t>
+              <w:t>${</w:t>
+            </w:r>
+            <w:proofErr w:type="spellStart"/>
+            <w:r>
+              <w:rPr>
+                <w:lang w:val="en-US"/>
+              </w:rPr>
+              <w:t>tempat_lahir</w:t>
+            </w:r>
+            <w:proofErr w:type="spellEnd"/>
+            <w:r>
+              <w:rPr>
+                <w:lang w:val="en-US"/>
+              </w:rPr>
+              <w:t>}</w:t>
             </w:r>
           </w:p>
         </w:tc>
@@ -360,158 +802,47 @@
             </w:tcMar>
           </w:tcPr>
           <w:p>
+            <w:proofErr w:type="spellStart"/>
             <w:r>
               <w:rPr>
                 <w:lang w:val="en-US"/>
               </w:rPr>
-              <w:t>Umur / Tgl Lahir</w:t>
+              <w:t>Umur</w:t>
             </w:r>
+            <w:proofErr w:type="spellEnd"/>
+            <w:r>
+              <w:rPr>
+                <w:lang w:val="en-US"/>
+              </w:rPr>
+              <w:t xml:space="preserve"> / </w:t>
+            </w:r>
+            <w:proofErr w:type="spellStart"/>
+            <w:r>
+              <w:rPr>
+                <w:lang w:val="en-US"/>
+              </w:rPr>
+              <w:t>Tgl</w:t>
+            </w:r>
+            <w:proofErr w:type="spellEnd"/>
+            <w:r>
+              <w:rPr>
+                <w:lang w:val="en-US"/>
+              </w:rPr>
+              <w:t xml:space="preserve"> </w:t>
+            </w:r>
+            <w:proofErr w:type="spellStart"/>
+            <w:r>
+              <w:rPr>
+                <w:lang w:val="en-US"/>
+              </w:rPr>
+              <w:t>Lahir</w:t>
+            </w:r>
+            <w:proofErr w:type="spellEnd"/>
           </w:p>
         </w:tc>
         <w:tc>
           <w:tcPr>
-            <w:tcW w:w="283" w:type="dxa"/>
-            <w:tcMar>
-              <w:top w:w="0" w:type="dxa"/>
-              <w:left w:w="108" w:type="dxa"/>
-              <w:bottom w:w="0" w:type="dxa"/>
-              <w:right w:w="108" w:type="dxa"/>
-            </w:tcMar>
-          </w:tcPr>
-          <w:p>
-            <w:r>
-              <w:rPr>
-                <w:lang w:val="en-US"/>
-              </w:rPr>
-              <w:t>:</w:t>
-            </w:r>
-          </w:p>
-        </w:tc>
-        <w:tc>
-          <w:tcPr>
-            <w:tcW w:w="6895" w:type="dxa"/>
-            <w:tcMar>
-              <w:top w:w="0" w:type="dxa"/>
-              <w:left w:w="108" w:type="dxa"/>
-              <w:bottom w:w="0" w:type="dxa"/>
-              <w:right w:w="108" w:type="dxa"/>
-            </w:tcMar>
-          </w:tcPr>
-          <w:p>
-            <w:pPr>
-              <w:rPr>
-                <w:lang w:val="en-US"/>
-              </w:rPr>
-            </w:pPr>
-            <w:r>
-              <w:rPr>
-                <w:color w:val="FF0000"/>
-                <w:lang w:val="en-US"/>
-              </w:rPr>
-              <w:t xml:space="preserve">${umur) </w:t>
-            </w:r>
-            <w:r>
-              <w:rPr>
-                <w:color w:val="FF0000"/>
-                <w:lang w:val="en-US"/>
-              </w:rPr>
-              <w:t xml:space="preserve">Tahun / </w:t>
-            </w:r>
-            <w:r>
-              <w:rPr>
-                <w:color w:val="FF0000"/>
-                <w:lang w:val="en-US"/>
-              </w:rPr>
-              <w:t>${tgl_lahir}</w:t>
-            </w:r>
-          </w:p>
-        </w:tc>
-      </w:tr>
-      <w:tr>
-        <w:tc>
-          <w:tcPr>
-            <w:tcW w:w="3706" w:type="dxa"/>
-            <w:tcMar>
-              <w:top w:w="0" w:type="dxa"/>
-              <w:left w:w="108" w:type="dxa"/>
-              <w:bottom w:w="0" w:type="dxa"/>
-              <w:right w:w="108" w:type="dxa"/>
-            </w:tcMar>
-          </w:tcPr>
-          <w:p>
-            <w:r>
-              <w:t>Jenis kelamin</w:t>
-            </w:r>
-          </w:p>
-        </w:tc>
-        <w:tc>
-          <w:tcPr>
-            <w:tcW w:w="283" w:type="dxa"/>
-            <w:tcMar>
-              <w:top w:w="0" w:type="dxa"/>
-              <w:left w:w="108" w:type="dxa"/>
-              <w:bottom w:w="0" w:type="dxa"/>
-              <w:right w:w="108" w:type="dxa"/>
-            </w:tcMar>
-          </w:tcPr>
-          <w:p>
-            <w:r>
-              <w:rPr>
-                <w:lang w:val="en-US"/>
-              </w:rPr>
-              <w:t>:</w:t>
-            </w:r>
-          </w:p>
-        </w:tc>
-        <w:tc>
-          <w:tcPr>
-            <w:tcW w:w="6895" w:type="dxa"/>
-            <w:tcMar>
-              <w:top w:w="0" w:type="dxa"/>
-              <w:left w:w="108" w:type="dxa"/>
-              <w:bottom w:w="0" w:type="dxa"/>
-              <w:right w:w="108" w:type="dxa"/>
-            </w:tcMar>
-          </w:tcPr>
-          <w:p>
-            <w:pPr>
-              <w:rPr>
-                <w:lang w:val="en-US"/>
-              </w:rPr>
-            </w:pPr>
-            <w:r>
-              <w:rPr>
-                <w:color w:val="FF0000"/>
-                <w:lang w:val="en-US"/>
-              </w:rPr>
-              <w:t>${jenis_kelamin}</w:t>
-            </w:r>
-          </w:p>
-        </w:tc>
-      </w:tr>
-      <w:tr>
-        <w:trPr>
-          <w:trHeight w:val="260"/>
-        </w:trPr>
-        <w:tc>
-          <w:tcPr>
-            <w:tcW w:w="3706" w:type="dxa"/>
-            <w:tcMar>
-              <w:top w:w="0" w:type="dxa"/>
-              <w:left w:w="108" w:type="dxa"/>
-              <w:bottom w:w="0" w:type="dxa"/>
-              <w:right w:w="108" w:type="dxa"/>
-            </w:tcMar>
-          </w:tcPr>
-          <w:p>
-            <w:r>
-              <w:t>Kebangsaan/Kewarganegaraan</w:t>
-            </w:r>
-          </w:p>
-        </w:tc>
-        <w:tc>
-          <w:tcPr>
-            <w:tcW w:w="283" w:type="dxa"/>
+            <w:tcW w:w="371" w:type="dxa"/>
             <w:tcMar>
               <w:top w:w="0" w:type="dxa"/>
               <w:left w:w="108" w:type="dxa"/>
@@ -548,7 +879,61 @@
               <w:rPr>
                 <w:lang w:val="en-US"/>
               </w:rPr>
-              <w:t>${kewarganegaraan}</w:t>
+              <w:t>${</w:t>
+            </w:r>
+            <w:proofErr w:type="spellStart"/>
+            <w:r>
+              <w:rPr>
+                <w:lang w:val="en-US"/>
+              </w:rPr>
+              <w:t>umur</w:t>
+            </w:r>
+            <w:proofErr w:type="spellEnd"/>
+            <w:r>
+              <w:rPr>
+                <w:lang w:val="en-US"/>
+              </w:rPr>
+              <w:t>}</w:t>
+            </w:r>
+            <w:r>
+              <w:rPr>
+                <w:lang w:val="en-US"/>
+              </w:rPr>
+              <w:t xml:space="preserve"> </w:t>
+            </w:r>
+            <w:proofErr w:type="spellStart"/>
+            <w:r>
+              <w:rPr>
+                <w:lang w:val="en-US"/>
+              </w:rPr>
+              <w:t>Tahun</w:t>
+            </w:r>
+            <w:proofErr w:type="spellEnd"/>
+            <w:r>
+              <w:rPr>
+                <w:lang w:val="en-US"/>
+              </w:rPr>
+              <w:t xml:space="preserve"> / </w:t>
+            </w:r>
+            <w:r>
+              <w:rPr>
+                <w:lang w:val="en-US"/>
+              </w:rPr>
+              <w:t>${</w:t>
+            </w:r>
+            <w:proofErr w:type="spellStart"/>
+            <w:r>
+              <w:rPr>
+                <w:lang w:val="en-US"/>
+              </w:rPr>
+              <w:t>tgl_lahir</w:t>
+            </w:r>
+            <w:proofErr w:type="spellEnd"/>
+            <w:r>
+              <w:rPr>
+                <w:lang w:val="en-US"/>
+              </w:rPr>
+              <w:t>}</w:t>
             </w:r>
           </w:p>
         </w:tc>
@@ -566,13 +951,13 @@
           </w:tcPr>
           <w:p>
             <w:r>
-              <w:t>Tempat tinggal</w:t>
+              <w:t>Jenis kelamin</w:t>
             </w:r>
           </w:p>
         </w:tc>
         <w:tc>
           <w:tcPr>
-            <w:tcW w:w="283" w:type="dxa"/>
+            <w:tcW w:w="371" w:type="dxa"/>
             <w:tcMar>
               <w:top w:w="0" w:type="dxa"/>
               <w:left w:w="108" w:type="dxa"/>
@@ -609,7 +994,174 @@
               <w:rPr>
                 <w:lang w:val="en-US"/>
               </w:rPr>
-              <w:t>${alamat}</w:t>
+              <w:t>${</w:t>
+            </w:r>
+            <w:proofErr w:type="spellStart"/>
+            <w:r>
+              <w:rPr>
+                <w:lang w:val="en-US"/>
+              </w:rPr>
+              <w:t>jenis_kelamin</w:t>
+            </w:r>
+            <w:proofErr w:type="spellEnd"/>
+            <w:r>
+              <w:rPr>
+                <w:lang w:val="en-US"/>
+              </w:rPr>
+              <w:t>}</w:t>
+            </w:r>
+          </w:p>
+        </w:tc>
+      </w:tr>
+      <w:tr>
+        <w:trPr>
+          <w:trHeight w:val="260"/>
+        </w:trPr>
+        <w:tc>
+          <w:tcPr>
+            <w:tcW w:w="3706" w:type="dxa"/>
+            <w:tcMar>
+              <w:top w:w="0" w:type="dxa"/>
+              <w:left w:w="108" w:type="dxa"/>
+              <w:bottom w:w="0" w:type="dxa"/>
+              <w:right w:w="108" w:type="dxa"/>
+            </w:tcMar>
+          </w:tcPr>
+          <w:p>
+            <w:r>
+              <w:t>Kebangsaan/Kewarganegaraan</w:t>
+            </w:r>
+          </w:p>
+        </w:tc>
+        <w:tc>
+          <w:tcPr>
+            <w:tcW w:w="371" w:type="dxa"/>
+            <w:tcMar>
+              <w:top w:w="0" w:type="dxa"/>
+              <w:left w:w="108" w:type="dxa"/>
+              <w:bottom w:w="0" w:type="dxa"/>
+              <w:right w:w="108" w:type="dxa"/>
+            </w:tcMar>
+          </w:tcPr>
+          <w:p>
+            <w:r>
+              <w:rPr>
+                <w:lang w:val="en-US"/>
+              </w:rPr>
+              <w:t>:</w:t>
+            </w:r>
+          </w:p>
+        </w:tc>
+        <w:tc>
+          <w:tcPr>
+            <w:tcW w:w="6895" w:type="dxa"/>
+            <w:tcMar>
+              <w:top w:w="0" w:type="dxa"/>
+              <w:left w:w="108" w:type="dxa"/>
+              <w:bottom w:w="0" w:type="dxa"/>
+              <w:right w:w="108" w:type="dxa"/>
+            </w:tcMar>
+          </w:tcPr>
+          <w:p>
+            <w:pPr>
+              <w:rPr>
+                <w:lang w:val="en-US"/>
+              </w:rPr>
+            </w:pPr>
+            <w:r>
+              <w:rPr>
+                <w:lang w:val="en-US"/>
+              </w:rPr>
+              <w:t>${</w:t>
+            </w:r>
+            <w:proofErr w:type="spellStart"/>
+            <w:r>
+              <w:rPr>
+                <w:lang w:val="en-US"/>
+              </w:rPr>
+              <w:t>kewarganegaraan</w:t>
+            </w:r>
+            <w:proofErr w:type="spellEnd"/>
+            <w:r>
+              <w:rPr>
+                <w:lang w:val="en-US"/>
+              </w:rPr>
+              <w:t>}</w:t>
+            </w:r>
+          </w:p>
+        </w:tc>
+      </w:tr>
+      <w:tr>
+        <w:tc>
+          <w:tcPr>
+            <w:tcW w:w="3706" w:type="dxa"/>
+            <w:tcMar>
+              <w:top w:w="0" w:type="dxa"/>
+              <w:left w:w="108" w:type="dxa"/>
+              <w:bottom w:w="0" w:type="dxa"/>
+              <w:right w:w="108" w:type="dxa"/>
+            </w:tcMar>
+          </w:tcPr>
+          <w:p>
+            <w:r>
+              <w:t>Tempat tinggal</w:t>
+            </w:r>
+          </w:p>
+        </w:tc>
+        <w:tc>
+          <w:tcPr>
+            <w:tcW w:w="371" w:type="dxa"/>
+            <w:tcMar>
+              <w:top w:w="0" w:type="dxa"/>
+              <w:left w:w="108" w:type="dxa"/>
+              <w:bottom w:w="0" w:type="dxa"/>
+              <w:right w:w="108" w:type="dxa"/>
+            </w:tcMar>
+          </w:tcPr>
+          <w:p>
+            <w:r>
+              <w:rPr>
+                <w:lang w:val="en-US"/>
+              </w:rPr>
+              <w:t>:</w:t>
+            </w:r>
+          </w:p>
+        </w:tc>
+        <w:tc>
+          <w:tcPr>
+            <w:tcW w:w="6895" w:type="dxa"/>
+            <w:tcMar>
+              <w:top w:w="0" w:type="dxa"/>
+              <w:left w:w="108" w:type="dxa"/>
+              <w:bottom w:w="0" w:type="dxa"/>
+              <w:right w:w="108" w:type="dxa"/>
+            </w:tcMar>
+          </w:tcPr>
+          <w:p>
+            <w:pPr>
+              <w:rPr>
+                <w:lang w:val="en-US"/>
+              </w:rPr>
+            </w:pPr>
+            <w:r>
+              <w:rPr>
+                <w:lang w:val="en-US"/>
+              </w:rPr>
+              <w:t>${</w:t>
+            </w:r>
+            <w:proofErr w:type="spellStart"/>
+            <w:r>
+              <w:rPr>
+                <w:lang w:val="en-US"/>
+              </w:rPr>
+              <w:t>alamat</w:t>
+            </w:r>
+            <w:proofErr w:type="spellEnd"/>
+            <w:r>
+              <w:rPr>
+                <w:lang w:val="en-US"/>
+              </w:rPr>
+              <w:t>}</w:t>
             </w:r>
           </w:p>
         </w:tc>
@@ -633,7 +1185,7 @@
         </w:tc>
         <w:tc>
           <w:tcPr>
-            <w:tcW w:w="283" w:type="dxa"/>
+            <w:tcW w:w="371" w:type="dxa"/>
             <w:tcMar>
               <w:top w:w="0" w:type="dxa"/>
               <w:left w:w="108" w:type="dxa"/>
@@ -694,7 +1246,7 @@
         </w:tc>
         <w:tc>
           <w:tcPr>
-            <w:tcW w:w="283" w:type="dxa"/>
+            <w:tcW w:w="371" w:type="dxa"/>
             <w:tcMar>
               <w:top w:w="0" w:type="dxa"/>
               <w:left w:w="108" w:type="dxa"/>
@@ -724,10 +1276,23 @@
           <w:p>
             <w:r>
               <w:rPr>
-                <w:color w:val="FF0000"/>
                 <w:lang w:val="en-US"/>
               </w:rPr>
-              <w:t>${pekerjaan}</w:t>
+              <w:t>${</w:t>
+            </w:r>
+            <w:proofErr w:type="spellStart"/>
+            <w:r>
+              <w:rPr>
+                <w:lang w:val="en-US"/>
+              </w:rPr>
+              <w:t>pekerjaan</w:t>
+            </w:r>
+            <w:proofErr w:type="spellEnd"/>
+            <w:r>
+              <w:rPr>
+                <w:lang w:val="en-US"/>
+              </w:rPr>
+              <w:t>}</w:t>
             </w:r>
           </w:p>
         </w:tc>
@@ -751,7 +1316,7 @@
         </w:tc>
         <w:tc>
           <w:tcPr>
-            <w:tcW w:w="283" w:type="dxa"/>
+            <w:tcW w:w="371" w:type="dxa"/>
             <w:tcMar>
               <w:top w:w="0" w:type="dxa"/>
               <w:left w:w="108" w:type="dxa"/>
@@ -781,10 +1346,29 @@
           <w:p>
             <w:r>
               <w:rPr>
-                <w:color w:val="FF0000"/>
                 <w:lang w:val="en-US"/>
               </w:rPr>
-              <w:t>${Pendidikan}</w:t>
+              <w:t>${</w:t>
+            </w:r>
+            <w:proofErr w:type="spellStart"/>
+            <w:r>
+              <w:rPr>
+                <w:lang w:val="en-US"/>
+              </w:rPr>
+              <w:t>p</w:t>
+            </w:r>
+            <w:r>
+              <w:rPr>
+                <w:lang w:val="en-US"/>
+              </w:rPr>
+              <w:t>endidikan</w:t>
+            </w:r>
+            <w:proofErr w:type="spellEnd"/>
+            <w:r>
+              <w:rPr>
+                <w:lang w:val="en-US"/>
+              </w:rPr>
+              <w:t>}</w:t>
             </w:r>
           </w:p>
         </w:tc>
@@ -799,8 +1383,14 @@
     <w:p>
       <w:pPr>
         <w:jc w:val="center"/>
+        <w:rPr>
+          <w:b/>
+        </w:rPr>
       </w:pPr>
       <w:r>
+        <w:rPr>
+          <w:b/>
+        </w:rPr>
         <w:t>MENGHADAP KEPADA :</w:t>
       </w:r>
     </w:p>
@@ -812,18 +1402,17 @@
     <w:tbl>
       <w:tblPr>
         <w:tblW w:w="0" w:type="auto"/>
-        <w:tblInd w:w="0" w:type="dxa"/>
         <w:tblLook w:val="0000" w:firstRow="0" w:lastRow="0" w:firstColumn="0" w:lastColumn="0" w:noHBand="0" w:noVBand="0"/>
       </w:tblPr>
       <w:tblGrid>
-        <w:gridCol w:w="3020"/>
-        <w:gridCol w:w="283"/>
+        <w:gridCol w:w="3652"/>
+        <w:gridCol w:w="425"/>
         <w:gridCol w:w="5559"/>
       </w:tblGrid>
       <w:tr>
         <w:tc>
           <w:tcPr>
-            <w:tcW w:w="3020" w:type="dxa"/>
+            <w:tcW w:w="3652" w:type="dxa"/>
             <w:tcMar>
               <w:top w:w="0" w:type="dxa"/>
               <w:left w:w="108" w:type="dxa"/>
@@ -839,7 +1428,7 @@
         </w:tc>
         <w:tc>
           <w:tcPr>
-            <w:tcW w:w="278" w:type="dxa"/>
+            <w:tcW w:w="425" w:type="dxa"/>
             <w:tcMar>
               <w:top w:w="0" w:type="dxa"/>
               <w:left w:w="108" w:type="dxa"/>
@@ -876,7 +1465,21 @@
               <w:rPr>
                 <w:lang w:val="en-US"/>
               </w:rPr>
-              <w:t>${jpu}</w:t>
+              <w:t>${</w:t>
+            </w:r>
+            <w:proofErr w:type="spellStart"/>
+            <w:r>
+              <w:rPr>
+                <w:lang w:val="en-US"/>
+              </w:rPr>
+              <w:t>jpu</w:t>
+            </w:r>
+            <w:proofErr w:type="spellEnd"/>
+            <w:r>
+              <w:rPr>
+                <w:lang w:val="en-US"/>
+              </w:rPr>
+              <w:t>}</w:t>
             </w:r>
           </w:p>
         </w:tc>
@@ -884,7 +1487,7 @@
       <w:tr>
         <w:tc>
           <w:tcPr>
-            <w:tcW w:w="3020" w:type="dxa"/>
+            <w:tcW w:w="3652" w:type="dxa"/>
             <w:tcMar>
               <w:top w:w="0" w:type="dxa"/>
               <w:left w:w="108" w:type="dxa"/>
@@ -900,7 +1503,7 @@
         </w:tc>
         <w:tc>
           <w:tcPr>
-            <w:tcW w:w="278" w:type="dxa"/>
+            <w:tcW w:w="425" w:type="dxa"/>
             <w:tcMar>
               <w:top w:w="0" w:type="dxa"/>
               <w:left w:w="108" w:type="dxa"/>
@@ -928,19 +1531,35 @@
             </w:tcMar>
           </w:tcPr>
           <w:p>
+            <w:proofErr w:type="spellStart"/>
             <w:r>
               <w:rPr>
                 <w:lang w:val="en-US"/>
               </w:rPr>
-              <w:t>Pengadilan Negeri Boyolali</w:t>
+              <w:t>Pengadilan</w:t>
             </w:r>
+            <w:proofErr w:type="spellEnd"/>
+            <w:r>
+              <w:rPr>
+                <w:lang w:val="en-US"/>
+              </w:rPr>
+              <w:t xml:space="preserve"> Negeri </w:t>
+            </w:r>
+            <w:proofErr w:type="spellStart"/>
+            <w:r>
+              <w:rPr>
+                <w:lang w:val="en-US"/>
+              </w:rPr>
+              <w:t>Boyolali</w:t>
+            </w:r>
+            <w:proofErr w:type="spellEnd"/>
           </w:p>
         </w:tc>
       </w:tr>
       <w:tr>
         <w:tc>
           <w:tcPr>
-            <w:tcW w:w="3020" w:type="dxa"/>
+            <w:tcW w:w="3652" w:type="dxa"/>
             <w:tcMar>
               <w:top w:w="0" w:type="dxa"/>
               <w:left w:w="108" w:type="dxa"/>
@@ -956,7 +1575,7 @@
         </w:tc>
         <w:tc>
           <w:tcPr>
-            <w:tcW w:w="278" w:type="dxa"/>
+            <w:tcW w:w="425" w:type="dxa"/>
             <w:tcMar>
               <w:top w:w="0" w:type="dxa"/>
               <w:left w:w="108" w:type="dxa"/>
@@ -991,10 +1610,23 @@
             </w:pPr>
             <w:r>
               <w:rPr>
-                <w:color w:val="FF0000"/>
                 <w:lang w:val="en-US"/>
               </w:rPr>
-              <w:t>${hari_sidang}</w:t>
+              <w:t>${</w:t>
+            </w:r>
+            <w:proofErr w:type="spellStart"/>
+            <w:r>
+              <w:rPr>
+                <w:lang w:val="en-US"/>
+              </w:rPr>
+              <w:t>hari_sidang</w:t>
+            </w:r>
+            <w:proofErr w:type="spellEnd"/>
+            <w:r>
+              <w:rPr>
+                <w:lang w:val="en-US"/>
+              </w:rPr>
+              <w:t>}</w:t>
             </w:r>
           </w:p>
         </w:tc>
@@ -1002,7 +1634,7 @@
       <w:tr>
         <w:tc>
           <w:tcPr>
-            <w:tcW w:w="3020" w:type="dxa"/>
+            <w:tcW w:w="3652" w:type="dxa"/>
             <w:tcMar>
               <w:top w:w="0" w:type="dxa"/>
               <w:left w:w="108" w:type="dxa"/>
@@ -1018,7 +1650,7 @@
         </w:tc>
         <w:tc>
           <w:tcPr>
-            <w:tcW w:w="278" w:type="dxa"/>
+            <w:tcW w:w="425" w:type="dxa"/>
             <w:tcMar>
               <w:top w:w="0" w:type="dxa"/>
               <w:left w:w="108" w:type="dxa"/>
@@ -1059,8 +1691,16 @@
               <w:rPr>
                 <w:lang w:val="en-US"/>
               </w:rPr>
-              <w:t>WIB – Selesai</w:t>
+              <w:t xml:space="preserve">WIB – </w:t>
             </w:r>
+            <w:proofErr w:type="spellStart"/>
+            <w:r>
+              <w:rPr>
+                <w:lang w:val="en-US"/>
+              </w:rPr>
+              <w:t>Selesai</w:t>
+            </w:r>
+            <w:proofErr w:type="spellEnd"/>
           </w:p>
         </w:tc>
       </w:tr>
@@ -1070,7 +1710,7 @@
         </w:trPr>
         <w:tc>
           <w:tcPr>
-            <w:tcW w:w="3020" w:type="dxa"/>
+            <w:tcW w:w="3652" w:type="dxa"/>
             <w:tcMar>
               <w:top w:w="0" w:type="dxa"/>
               <w:left w:w="108" w:type="dxa"/>
@@ -1079,17 +1719,33 @@
             </w:tcMar>
           </w:tcPr>
           <w:p>
+            <w:proofErr w:type="spellStart"/>
             <w:r>
               <w:rPr>
                 <w:lang w:val="en-US"/>
               </w:rPr>
-              <w:t>Untuk Keperluan</w:t>
+              <w:t>Untuk</w:t>
             </w:r>
+            <w:proofErr w:type="spellEnd"/>
+            <w:r>
+              <w:rPr>
+                <w:lang w:val="en-US"/>
+              </w:rPr>
+              <w:t xml:space="preserve"> </w:t>
+            </w:r>
+            <w:proofErr w:type="spellStart"/>
+            <w:r>
+              <w:rPr>
+                <w:lang w:val="en-US"/>
+              </w:rPr>
+              <w:t>Keperluan</w:t>
+            </w:r>
+            <w:proofErr w:type="spellEnd"/>
           </w:p>
         </w:tc>
         <w:tc>
           <w:tcPr>
-            <w:tcW w:w="278" w:type="dxa"/>
+            <w:tcW w:w="425" w:type="dxa"/>
             <w:tcMar>
               <w:top w:w="0" w:type="dxa"/>
               <w:left w:w="108" w:type="dxa"/>
@@ -1122,12 +1778,14 @@
                 <w:lang w:val="en-US"/>
               </w:rPr>
             </w:pPr>
+            <w:proofErr w:type="spellStart"/>
             <w:r>
               <w:rPr>
                 <w:lang w:val="en-US"/>
               </w:rPr>
               <w:t>Persidangan</w:t>
             </w:r>
+            <w:proofErr w:type="spellEnd"/>
             <w:r>
               <w:t xml:space="preserve"> Dengan Agenda </w:t>
             </w:r>
@@ -1213,7 +1871,6 @@
       <w:tblPr>
         <w:tblW w:w="0" w:type="auto"/>
         <w:jc w:val="center"/>
-        <w:tblInd w:w="0" w:type="dxa"/>
         <w:tblLook w:val="0000" w:firstRow="0" w:lastRow="0" w:firstColumn="0" w:lastColumn="0" w:noHBand="0" w:noVBand="0"/>
       </w:tblPr>
       <w:tblGrid>
@@ -1249,12 +1906,14 @@
             <w:pPr>
               <w:jc w:val="center"/>
             </w:pPr>
+            <w:proofErr w:type="spellStart"/>
             <w:r>
               <w:rPr>
                 <w:lang w:val="en-US"/>
               </w:rPr>
               <w:t>Terdakwa</w:t>
             </w:r>
+            <w:proofErr w:type="spellEnd"/>
           </w:p>
           <w:p/>
           <w:p/>
@@ -1289,7 +1948,25 @@
                 <w:bCs/>
                 <w:lang w:val="en-US"/>
               </w:rPr>
-              <w:t xml:space="preserve">{nama_terdakwa} </w:t>
+              <w:t>{</w:t>
+            </w:r>
+            <w:proofErr w:type="spellStart"/>
+            <w:r>
+              <w:rPr>
+                <w:b/>
+                <w:bCs/>
+                <w:lang w:val="en-US"/>
+              </w:rPr>
+              <w:t>nama_terdakwa</w:t>
+            </w:r>
+            <w:proofErr w:type="spellEnd"/>
+            <w:r>
+              <w:rPr>
+                <w:b/>
+                <w:bCs/>
+                <w:lang w:val="en-US"/>
+              </w:rPr>
+              <w:t xml:space="preserve">} </w:t>
             </w:r>
             <w:r>
               <w:rPr>
@@ -1320,17 +1997,33 @@
               </w:rPr>
             </w:pPr>
             <w:r>
+              <w:t>${kota_surat}</w:t>
+            </w:r>
+            <w:r>
               <w:rPr>
                 <w:lang w:val="en-US"/>
               </w:rPr>
-              <w:t xml:space="preserve">Boyolali, </w:t>
+              <w:t xml:space="preserve">, </w:t>
             </w:r>
             <w:r>
               <w:rPr>
-                <w:color w:val="FF0000"/>
                 <w:lang w:val="en-US"/>
               </w:rPr>
-              <w:t>${tanggal_surat}</w:t>
+              <w:t>${</w:t>
+            </w:r>
+            <w:proofErr w:type="spellStart"/>
+            <w:r>
+              <w:rPr>
+                <w:lang w:val="en-US"/>
+              </w:rPr>
+              <w:t>tanggal_surat</w:t>
+            </w:r>
+            <w:proofErr w:type="spellEnd"/>
+            <w:r>
+              <w:rPr>
+                <w:lang w:val="en-US"/>
+              </w:rPr>
+              <w:t>}</w:t>
             </w:r>
           </w:p>
           <w:p>
@@ -1348,7 +2041,25 @@
                 <w:bCs/>
                 <w:lang w:val="en-US"/>
               </w:rPr>
-              <w:t>A.N KEPALA KEJAKSAAN NEGERI BOYOLALI KASI TINDAK PIDANA UMUM</w:t>
+              <w:t xml:space="preserve">A.N KEPALA </w:t>
+            </w:r>
+            <w:r>
+              <w:rPr>
+                <w:b/>
+              </w:rPr>
+              <w:t>${</w:t>
+            </w:r>
+            <w:r>
+              <w:rPr>
+                <w:b/>
+              </w:rPr>
+              <w:t>nama_instansi</w:t>
+            </w:r>
+            <w:r>
+              <w:rPr>
+                <w:b/>
+              </w:rPr>
+              <w:t>}</w:t>
             </w:r>
           </w:p>
           <w:p>
@@ -1358,10 +2069,43 @@
             <w:r>
               <w:rPr>
                 <w:b/>
+              </w:rPr>
+              <w:t>${</w:t>
+            </w:r>
+            <w:r>
+              <w:rPr>
+                <w:b/>
+              </w:rPr>
+              <w:t>ttd_jabatan</w:t>
+            </w:r>
+            <w:r>
+              <w:rPr>
+                <w:b/>
+              </w:rPr>
+              <w:t>},</w:t>
+            </w:r>
+          </w:p>
+          <w:p>
+            <w:pPr>
+              <w:jc w:val="center"/>
+            </w:pPr>
+            <w:proofErr w:type="spellStart"/>
+            <w:r>
+              <w:rPr>
+                <w:b/>
                 <w:bCs/>
                 <w:lang w:val="en-US"/>
               </w:rPr>
-              <w:t>Ub. PENUNTUT UMUM</w:t>
+              <w:t>Ub</w:t>
+            </w:r>
+            <w:proofErr w:type="spellEnd"/>
+            <w:r>
+              <w:rPr>
+                <w:b/>
+                <w:bCs/>
+                <w:lang w:val="en-US"/>
+              </w:rPr>
+              <w:t>. PENUNTUT UMUM</w:t>
             </w:r>
           </w:p>
           <w:p>
@@ -1383,7 +2127,6 @@
             <w:pPr>
               <w:jc w:val="center"/>
               <w:rPr>
-                <w:color w:val="FF0000"/>
                 <w:lang w:val="en-US"/>
               </w:rPr>
             </w:pPr>
@@ -1391,26 +2134,38 @@
               <w:rPr>
                 <w:b/>
                 <w:bCs/>
-                <w:color w:val="FF0000"/>
                 <w:u w:val="single"/>
                 <w:lang w:val="en-US"/>
               </w:rPr>
-              <w:t>${jpu}</w:t>
+              <w:t>${</w:t>
+            </w:r>
+            <w:proofErr w:type="spellStart"/>
+            <w:r>
+              <w:rPr>
+                <w:b/>
+                <w:bCs/>
+                <w:u w:val="single"/>
+                <w:lang w:val="en-US"/>
+              </w:rPr>
+              <w:t>jpu</w:t>
+            </w:r>
+            <w:proofErr w:type="spellEnd"/>
+            <w:r>
+              <w:rPr>
+                <w:b/>
+                <w:bCs/>
+                <w:u w:val="single"/>
+                <w:lang w:val="en-US"/>
+              </w:rPr>
+              <w:t>}</w:t>
             </w:r>
           </w:p>
           <w:p>
             <w:pPr>
-              <w:jc w:val="center"/>
               <w:rPr>
                 <w:lang w:val="en-US"/>
               </w:rPr>
             </w:pPr>
-            <w:r>
-              <w:rPr>
-                <w:lang w:val="en-US"/>
-              </w:rPr>
-              <w:t>${nip_jpu}</w:t>
-            </w:r>
           </w:p>
         </w:tc>
       </w:tr>
@@ -1435,6 +2190,7 @@
     <w:lvl w:ilvl="0">
       <w:start w:val="1"/>
       <w:numFmt w:val="decimal"/>
+      <w:pStyle w:val="ListNumber5"/>
       <w:lvlText w:val="%1."/>
       <w:lvlJc w:val="left"/>
       <w:pPr>
@@ -1452,6 +2208,7 @@
     <w:lvl w:ilvl="0">
       <w:start w:val="1"/>
       <w:numFmt w:val="decimal"/>
+      <w:pStyle w:val="ListNumber4"/>
       <w:lvlText w:val="%1."/>
       <w:lvlJc w:val="left"/>
       <w:pPr>
@@ -1469,6 +2226,7 @@
     <w:lvl w:ilvl="0">
       <w:start w:val="1"/>
       <w:numFmt w:val="decimal"/>
+      <w:pStyle w:val="ListNumber3"/>
       <w:lvlText w:val="%1."/>
       <w:lvlJc w:val="left"/>
       <w:pPr>
@@ -1486,6 +2244,7 @@
     <w:lvl w:ilvl="0">
       <w:start w:val="1"/>
       <w:numFmt w:val="decimal"/>
+      <w:pStyle w:val="ListNumber2"/>
       <w:lvlText w:val="%1."/>
       <w:lvlJc w:val="left"/>
       <w:pPr>
@@ -1503,6 +2262,7 @@
     <w:lvl w:ilvl="0">
       <w:start w:val="1"/>
       <w:numFmt w:val="bullet"/>
+      <w:pStyle w:val="ListBullet5"/>
       <w:lvlText w:val=""/>
       <w:lvlJc w:val="left"/>
       <w:pPr>
@@ -1523,6 +2283,7 @@
     <w:lvl w:ilvl="0">
       <w:start w:val="1"/>
       <w:numFmt w:val="bullet"/>
+      <w:pStyle w:val="ListBullet4"/>
       <w:lvlText w:val=""/>
       <w:lvlJc w:val="left"/>
       <w:pPr>
@@ -1543,6 +2304,7 @@
     <w:lvl w:ilvl="0">
       <w:start w:val="1"/>
       <w:numFmt w:val="bullet"/>
+      <w:pStyle w:val="ListBullet3"/>
       <w:lvlText w:val=""/>
       <w:lvlJc w:val="left"/>
       <w:pPr>
@@ -1563,6 +2325,7 @@
     <w:lvl w:ilvl="0">
       <w:start w:val="1"/>
       <w:numFmt w:val="bullet"/>
+      <w:pStyle w:val="ListBullet2"/>
       <w:lvlText w:val=""/>
       <w:lvlJc w:val="left"/>
       <w:pPr>
@@ -1583,6 +2346,7 @@
     <w:lvl w:ilvl="0">
       <w:start w:val="1"/>
       <w:numFmt w:val="decimal"/>
+      <w:pStyle w:val="ListNumber"/>
       <w:lvlText w:val="%1."/>
       <w:lvlJc w:val="left"/>
       <w:pPr>
@@ -1600,6 +2364,7 @@
     <w:lvl w:ilvl="0">
       <w:start w:val="1"/>
       <w:numFmt w:val="bullet"/>
+      <w:pStyle w:val="ListBullet"/>
       <w:lvlText w:val=""/>
       <w:lvlJc w:val="left"/>
       <w:pPr>
@@ -1691,11 +2456,54 @@
     <w:lsdException w:name="HTML Bottom of Form" w:semiHidden="1" w:uiPriority="99" w:unhideWhenUsed="1"/>
     <w:lsdException w:name="HTML Address" w:qFormat="1"/>
     <w:lsdException w:name="HTML Cite" w:qFormat="1"/>
-    <w:lsdException w:name="Normal Table" w:semiHidden="1" w:qFormat="1"/>
+    <w:lsdException w:name="Normal Table" w:semiHidden="1" w:unhideWhenUsed="1" w:qFormat="1"/>
     <w:lsdException w:name="No List" w:semiHidden="1" w:uiPriority="99" w:unhideWhenUsed="1"/>
     <w:lsdException w:name="Outline List 1" w:semiHidden="1" w:uiPriority="99" w:unhideWhenUsed="1"/>
     <w:lsdException w:name="Outline List 2" w:semiHidden="1" w:uiPriority="99" w:unhideWhenUsed="1"/>
     <w:lsdException w:name="Outline List 3" w:semiHidden="1" w:uiPriority="99" w:unhideWhenUsed="1"/>
+    <w:lsdException w:name="Table Simple 1" w:semiHidden="1" w:unhideWhenUsed="1"/>
+    <w:lsdException w:name="Table Simple 2" w:semiHidden="1" w:unhideWhenUsed="1"/>
+    <w:lsdException w:name="Table Simple 3" w:semiHidden="1" w:unhideWhenUsed="1"/>
+    <w:lsdException w:name="Table Classic 1" w:semiHidden="1" w:unhideWhenUsed="1"/>
+    <w:lsdException w:name="Table Classic 2" w:semiHidden="1" w:unhideWhenUsed="1"/>
+    <w:lsdException w:name="Table Classic 3" w:semiHidden="1" w:unhideWhenUsed="1"/>
+    <w:lsdException w:name="Table Classic 4" w:semiHidden="1" w:unhideWhenUsed="1"/>
+    <w:lsdException w:name="Table Colorful 1" w:semiHidden="1" w:unhideWhenUsed="1"/>
+    <w:lsdException w:name="Table Colorful 2" w:semiHidden="1" w:unhideWhenUsed="1"/>
+    <w:lsdException w:name="Table Colorful 3" w:semiHidden="1" w:unhideWhenUsed="1"/>
+    <w:lsdException w:name="Table Columns 1" w:semiHidden="1" w:unhideWhenUsed="1"/>
+    <w:lsdException w:name="Table Columns 2" w:semiHidden="1" w:unhideWhenUsed="1"/>
+    <w:lsdException w:name="Table Columns 3" w:semiHidden="1" w:unhideWhenUsed="1"/>
+    <w:lsdException w:name="Table Columns 4" w:semiHidden="1" w:unhideWhenUsed="1"/>
+    <w:lsdException w:name="Table Columns 5" w:semiHidden="1" w:unhideWhenUsed="1"/>
+    <w:lsdException w:name="Table Grid 1" w:semiHidden="1" w:unhideWhenUsed="1"/>
+    <w:lsdException w:name="Table Grid 2" w:semiHidden="1" w:unhideWhenUsed="1"/>
+    <w:lsdException w:name="Table Grid 3" w:semiHidden="1" w:unhideWhenUsed="1"/>
+    <w:lsdException w:name="Table Grid 4" w:semiHidden="1" w:unhideWhenUsed="1"/>
+    <w:lsdException w:name="Table Grid 5" w:semiHidden="1" w:unhideWhenUsed="1"/>
+    <w:lsdException w:name="Table Grid 6" w:semiHidden="1" w:unhideWhenUsed="1"/>
+    <w:lsdException w:name="Table Grid 7" w:semiHidden="1" w:unhideWhenUsed="1"/>
+    <w:lsdException w:name="Table Grid 8" w:semiHidden="1" w:unhideWhenUsed="1"/>
+    <w:lsdException w:name="Table List 1" w:semiHidden="1" w:unhideWhenUsed="1"/>
+    <w:lsdException w:name="Table List 2" w:semiHidden="1" w:unhideWhenUsed="1"/>
+    <w:lsdException w:name="Table List 3" w:semiHidden="1" w:unhideWhenUsed="1"/>
+    <w:lsdException w:name="Table List 4" w:semiHidden="1" w:unhideWhenUsed="1"/>
+    <w:lsdException w:name="Table List 5" w:semiHidden="1" w:unhideWhenUsed="1"/>
+    <w:lsdException w:name="Table List 6" w:semiHidden="1" w:unhideWhenUsed="1"/>
+    <w:lsdException w:name="Table List 7" w:semiHidden="1" w:unhideWhenUsed="1"/>
+    <w:lsdException w:name="Table List 8" w:semiHidden="1" w:unhideWhenUsed="1"/>
+    <w:lsdException w:name="Table 3D effects 1" w:semiHidden="1" w:unhideWhenUsed="1"/>
+    <w:lsdException w:name="Table 3D effects 2" w:semiHidden="1" w:unhideWhenUsed="1"/>
+    <w:lsdException w:name="Table 3D effects 3" w:semiHidden="1" w:unhideWhenUsed="1"/>
+    <w:lsdException w:name="Table Contemporary" w:semiHidden="1" w:unhideWhenUsed="1"/>
+    <w:lsdException w:name="Table Elegant" w:semiHidden="1" w:unhideWhenUsed="1"/>
+    <w:lsdException w:name="Table Professional" w:semiHidden="1" w:unhideWhenUsed="1"/>
+    <w:lsdException w:name="Table Subtle 1" w:semiHidden="1" w:unhideWhenUsed="1"/>
+    <w:lsdException w:name="Table Subtle 2" w:semiHidden="1" w:unhideWhenUsed="1"/>
+    <w:lsdException w:name="Table Web 1" w:semiHidden="1" w:unhideWhenUsed="1"/>
+    <w:lsdException w:name="Table Web 2" w:semiHidden="1" w:unhideWhenUsed="1"/>
+    <w:lsdException w:name="Table Web 3" w:semiHidden="1" w:unhideWhenUsed="1"/>
+    <w:lsdException w:name="Table Theme" w:semiHidden="1" w:unhideWhenUsed="1"/>
     <w:lsdException w:name="Placeholder Text" w:semiHidden="1" w:uiPriority="99" w:unhideWhenUsed="1"/>
     <w:lsdException w:name="No Spacing" w:uiPriority="99" w:qFormat="1"/>
     <w:lsdException w:name="Light Shading" w:uiPriority="60"/>
@@ -2078,13 +2886,17 @@
   </w:style>
   <w:style w:type="character" w:default="1" w:styleId="DefaultParagraphFont">
     <w:name w:val="Default Paragraph Font"/>
+    <w:uiPriority w:val="1"/>
     <w:semiHidden/>
+    <w:unhideWhenUsed/>
   </w:style>
   <w:style w:type="table" w:default="1" w:styleId="TableNormal">
     <w:name w:val="Normal Table"/>
+    <w:uiPriority w:val="99"/>
     <w:semiHidden/>
-    <w:qFormat/>
+    <w:unhideWhenUsed/>
     <w:tblPr>
+      <w:tblInd w:w="0" w:type="dxa"/>
       <w:tblCellMar>
         <w:top w:w="0" w:type="dxa"/>
         <w:left w:w="108" w:type="dxa"/>
@@ -6116,7 +6928,7 @@
     <w:basedOn w:val="Normal"/>
     <w:next w:val="Normal"/>
     <w:pPr>
-      <w:ind w:leftChars="200" w:hangingChars="200" w:hanging="200"/>
+      <w:ind w:leftChars="200" w:left="200" w:hangingChars="200" w:hanging="200"/>
     </w:pPr>
   </w:style>
   <w:style w:type="table" w:styleId="TableProfessional">

</xml_diff>

<commit_message>
semi final module P37
</commit_message>
<xml_diff>
--- a/writable/templates/template_p37.docx
+++ b/writable/templates/template_p37.docx
@@ -3,6 +3,37 @@
 <w:document xmlns:wpc="http://schemas.microsoft.com/office/word/2010/wordprocessingCanvas" xmlns:cx="http://schemas.microsoft.com/office/drawing/2014/chartex" xmlns:cx1="http://schemas.microsoft.com/office/drawing/2015/9/8/chartex" xmlns:cx2="http://schemas.microsoft.com/office/drawing/2015/10/21/chartex" xmlns:cx3="http://schemas.microsoft.com/office/drawing/2016/5/9/chartex" xmlns:cx4="http://schemas.microsoft.com/office/drawing/2016/5/10/chartex" xmlns:cx5="http://schemas.microsoft.com/office/drawing/2016/5/11/chartex" xmlns:cx6="http://schemas.microsoft.com/office/drawing/2016/5/12/chartex" xmlns:cx7="http://schemas.microsoft.com/office/drawing/2016/5/13/chartex" xmlns:cx8="http://schemas.microsoft.com/office/drawing/2016/5/14/chartex" xmlns:mc="http://schemas.openxmlformats.org/markup-compatibility/2006" xmlns:aink="http://schemas.microsoft.com/office/drawing/2016/ink" xmlns:am3d="http://schemas.microsoft.com/office/drawing/2017/model3d" xmlns:o="urn:schemas-microsoft-com:office:office" xmlns:r="http://schemas.openxmlformats.org/officeDocument/2006/relationships" xmlns:m="http://schemas.openxmlformats.org/officeDocument/2006/math" xmlns:v="urn:schemas-microsoft-com:vml" xmlns:wp14="http://schemas.microsoft.com/office/word/2010/wordprocessingDrawing" xmlns:wp="http://schemas.openxmlformats.org/drawingml/2006/wordprocessingDrawing" xmlns:w10="urn:schemas-microsoft-com:office:word" xmlns:w="http://schemas.openxmlformats.org/wordprocessingml/2006/main" xmlns:w14="http://schemas.microsoft.com/office/word/2010/wordml" xmlns:w15="http://schemas.microsoft.com/office/word/2012/wordml" xmlns:w16cid="http://schemas.microsoft.com/office/word/2016/wordml/cid" xmlns:w16se="http://schemas.microsoft.com/office/word/2015/wordml/symex" xmlns:wpg="http://schemas.microsoft.com/office/word/2010/wordprocessingGroup" xmlns:wpi="http://schemas.microsoft.com/office/word/2010/wordprocessingInk" xmlns:wne="http://schemas.microsoft.com/office/word/2006/wordml" xmlns:wps="http://schemas.microsoft.com/office/word/2010/wordprocessingShape" mc:Ignorable="w14 w15 w16se w16cid wp14">
   <w:body>
     <w:p>
+      <w:r>
+        <w:rPr>
+          <w:b/>
+          <w:bCs/>
+          <w:noProof/>
+          <w:u w:val="single"/>
+          <w:lang w:val="en-US"/>
+        </w:rPr>
+        <w:pict w14:anchorId="4523D3BA">
+          <v:shapetype id="_x0000_t202" coordsize="21600,21600" o:spt="202" path="m,l,21600r21600,l21600,xe">
+            <v:stroke joinstyle="miter"/>
+            <v:path gradientshapeok="t" o:connecttype="rect"/>
+          </v:shapetype>
+          <v:shape id="_x0000_s1026" type="#_x0000_t202" style="position:absolute;margin-left:480.75pt;margin-top:-2.25pt;width:39.75pt;height:21pt;z-index:1" filled="f" stroked="f">
+            <v:textbox>
+              <w:txbxContent>
+                <w:p>
+                  <w:r>
+                    <w:rPr>
+                      <w:b/>
+                      <w:bCs/>
+                      <w:lang w:val="en-US"/>
+                    </w:rPr>
+                    <w:t>P37</w:t>
+                  </w:r>
+                </w:p>
+              </w:txbxContent>
+            </v:textbox>
+          </v:shape>
+        </w:pict>
+      </w:r>
       <w:r>
         <w:rPr>
           <w:b/>
@@ -88,16 +119,6 @@
       </w:r>
       <w:r>
         <w:tab/>
-      </w:r>
-      <w:bookmarkStart w:id="0" w:name="_GoBack"/>
-      <w:bookmarkEnd w:id="0"/>
-      <w:r>
-        <w:rPr>
-          <w:b/>
-          <w:bCs/>
-          <w:lang w:val="en-US"/>
-        </w:rPr>
-        <w:t>P37</w:t>
       </w:r>
     </w:p>
     <w:p>
@@ -935,6 +956,8 @@
               </w:rPr>
               <w:t>}</w:t>
             </w:r>
+            <w:bookmarkStart w:id="0" w:name="_GoBack"/>
+            <w:bookmarkEnd w:id="0"/>
           </w:p>
         </w:tc>
       </w:tr>

</xml_diff>

<commit_message>
update kodingan ke 28
</commit_message>
<xml_diff>
--- a/writable/templates/template_p37.docx
+++ b/writable/templates/template_p37.docx
@@ -1,6 +1,6 @@
 
 <file path=word/document.xml><?xml version="1.0" encoding="utf-8"?>
-<w:document xmlns:wpc="http://schemas.microsoft.com/office/word/2010/wordprocessingCanvas" xmlns:cx="http://schemas.microsoft.com/office/drawing/2014/chartex" xmlns:cx1="http://schemas.microsoft.com/office/drawing/2015/9/8/chartex" xmlns:cx2="http://schemas.microsoft.com/office/drawing/2015/10/21/chartex" xmlns:cx3="http://schemas.microsoft.com/office/drawing/2016/5/9/chartex" xmlns:cx4="http://schemas.microsoft.com/office/drawing/2016/5/10/chartex" xmlns:cx5="http://schemas.microsoft.com/office/drawing/2016/5/11/chartex" xmlns:cx6="http://schemas.microsoft.com/office/drawing/2016/5/12/chartex" xmlns:cx7="http://schemas.microsoft.com/office/drawing/2016/5/13/chartex" xmlns:cx8="http://schemas.microsoft.com/office/drawing/2016/5/14/chartex" xmlns:mc="http://schemas.openxmlformats.org/markup-compatibility/2006" xmlns:aink="http://schemas.microsoft.com/office/drawing/2016/ink" xmlns:am3d="http://schemas.microsoft.com/office/drawing/2017/model3d" xmlns:o="urn:schemas-microsoft-com:office:office" xmlns:r="http://schemas.openxmlformats.org/officeDocument/2006/relationships" xmlns:m="http://schemas.openxmlformats.org/officeDocument/2006/math" xmlns:v="urn:schemas-microsoft-com:vml" xmlns:wp14="http://schemas.microsoft.com/office/word/2010/wordprocessingDrawing" xmlns:wp="http://schemas.openxmlformats.org/drawingml/2006/wordprocessingDrawing" xmlns:w10="urn:schemas-microsoft-com:office:word" xmlns:w="http://schemas.openxmlformats.org/wordprocessingml/2006/main" xmlns:w14="http://schemas.microsoft.com/office/word/2010/wordml" xmlns:w15="http://schemas.microsoft.com/office/word/2012/wordml" xmlns:w16cid="http://schemas.microsoft.com/office/word/2016/wordml/cid" xmlns:w16se="http://schemas.microsoft.com/office/word/2015/wordml/symex" xmlns:wpg="http://schemas.microsoft.com/office/word/2010/wordprocessingGroup" xmlns:wpi="http://schemas.microsoft.com/office/word/2010/wordprocessingInk" xmlns:wne="http://schemas.microsoft.com/office/word/2006/wordml" xmlns:wps="http://schemas.microsoft.com/office/word/2010/wordprocessingShape" mc:Ignorable="w14 w15 w16se w16cid wp14">
+<w:document xmlns:wpc="http://schemas.microsoft.com/office/word/2010/wordprocessingCanvas" xmlns:cx="http://schemas.microsoft.com/office/drawing/2014/chartex" xmlns:cx1="http://schemas.microsoft.com/office/drawing/2015/9/8/chartex" xmlns:cx2="http://schemas.microsoft.com/office/drawing/2015/10/21/chartex" xmlns:cx3="http://schemas.microsoft.com/office/drawing/2016/5/9/chartex" xmlns:cx4="http://schemas.microsoft.com/office/drawing/2016/5/10/chartex" xmlns:cx5="http://schemas.microsoft.com/office/drawing/2016/5/11/chartex" xmlns:cx6="http://schemas.microsoft.com/office/drawing/2016/5/12/chartex" xmlns:cx7="http://schemas.microsoft.com/office/drawing/2016/5/13/chartex" xmlns:cx8="http://schemas.microsoft.com/office/drawing/2016/5/14/chartex" xmlns:mc="http://schemas.openxmlformats.org/markup-compatibility/2006" xmlns:aink="http://schemas.microsoft.com/office/drawing/2016/ink" xmlns:am3d="http://schemas.microsoft.com/office/drawing/2017/model3d" xmlns:o="urn:schemas-microsoft-com:office:office" xmlns:r="http://schemas.openxmlformats.org/officeDocument/2006/relationships" xmlns:m="http://schemas.openxmlformats.org/officeDocument/2006/math" xmlns:v="urn:schemas-microsoft-com:vml" xmlns:wp14="http://schemas.microsoft.com/office/word/2010/wordprocessingDrawing" xmlns:wp="http://schemas.openxmlformats.org/drawingml/2006/wordprocessingDrawing" xmlns:w10="urn:schemas-microsoft-com:office:word" xmlns:w="http://schemas.openxmlformats.org/wordprocessingml/2006/main" xmlns:w14="http://schemas.microsoft.com/office/word/2010/wordml" xmlns:w15="http://schemas.microsoft.com/office/word/2012/wordml" xmlns:w16cex="http://schemas.microsoft.com/office/word/2018/wordml/cex" xmlns:w16cid="http://schemas.microsoft.com/office/word/2016/wordml/cid" xmlns:w16="http://schemas.microsoft.com/office/word/2018/wordml" xmlns:w16sdtdh="http://schemas.microsoft.com/office/word/2020/wordml/sdtdatahash" xmlns:w16se="http://schemas.microsoft.com/office/word/2015/wordml/symex" xmlns:wpg="http://schemas.microsoft.com/office/word/2010/wordprocessingGroup" xmlns:wpi="http://schemas.microsoft.com/office/word/2010/wordprocessingInk" xmlns:wne="http://schemas.microsoft.com/office/word/2006/wordml" xmlns:wps="http://schemas.microsoft.com/office/word/2010/wordprocessingShape" mc:Ignorable="w14 w15 w16se w16cid w16 w16cex w16sdtdh wp14">
   <w:body>
     <w:p>
       <w:r>
@@ -849,16 +849,8 @@
               <w:rPr>
                 <w:lang w:val="en-US"/>
               </w:rPr>
-              <w:t xml:space="preserve"> </w:t>
+              <w:t xml:space="preserve"> Lahir</w:t>
             </w:r>
-            <w:proofErr w:type="spellStart"/>
-            <w:r>
-              <w:rPr>
-                <w:lang w:val="en-US"/>
-              </w:rPr>
-              <w:t>Lahir</w:t>
-            </w:r>
-            <w:proofErr w:type="spellEnd"/>
           </w:p>
         </w:tc>
         <w:tc>
@@ -956,8 +948,6 @@
               </w:rPr>
               <w:t>}</w:t>
             </w:r>
-            <w:bookmarkStart w:id="0" w:name="_GoBack"/>
-            <w:bookmarkEnd w:id="0"/>
           </w:p>
         </w:tc>
       </w:tr>
@@ -1632,6 +1622,15 @@
               </w:rPr>
             </w:pPr>
             <w:r>
+              <w:t>${nama_hari}</w:t>
+            </w:r>
+            <w:r>
+              <w:rPr>
+                <w:lang w:val="en-US"/>
+              </w:rPr>
+              <w:t xml:space="preserve">, </w:t>
+            </w:r>
+            <w:r>
               <w:rPr>
                 <w:lang w:val="en-US"/>
               </w:rPr>
@@ -2064,7 +2063,25 @@
                 <w:bCs/>
                 <w:lang w:val="en-US"/>
               </w:rPr>
-              <w:t xml:space="preserve">A.N KEPALA </w:t>
+              <w:t xml:space="preserve">A.N </w:t>
+            </w:r>
+            <w:proofErr w:type="spellStart"/>
+            <w:r>
+              <w:rPr>
+                <w:b/>
+                <w:bCs/>
+                <w:lang w:val="en-US"/>
+              </w:rPr>
+              <w:t>Kepala</w:t>
+            </w:r>
+            <w:proofErr w:type="spellEnd"/>
+            <w:r>
+              <w:rPr>
+                <w:b/>
+                <w:bCs/>
+                <w:lang w:val="en-US"/>
+              </w:rPr>
+              <w:t xml:space="preserve"> </w:t>
             </w:r>
             <w:r>
               <w:rPr>
@@ -2128,8 +2145,36 @@
                 <w:bCs/>
                 <w:lang w:val="en-US"/>
               </w:rPr>
-              <w:t>. PENUNTUT UMUM</w:t>
+              <w:t xml:space="preserve">. </w:t>
             </w:r>
+            <w:proofErr w:type="spellStart"/>
+            <w:r>
+              <w:rPr>
+                <w:b/>
+                <w:bCs/>
+                <w:lang w:val="en-US"/>
+              </w:rPr>
+              <w:t>Penuntut</w:t>
+            </w:r>
+            <w:proofErr w:type="spellEnd"/>
+            <w:r>
+              <w:rPr>
+                <w:b/>
+                <w:bCs/>
+                <w:lang w:val="en-US"/>
+              </w:rPr>
+              <w:t xml:space="preserve"> </w:t>
+            </w:r>
+            <w:proofErr w:type="spellStart"/>
+            <w:r>
+              <w:rPr>
+                <w:b/>
+                <w:bCs/>
+                <w:lang w:val="en-US"/>
+              </w:rPr>
+              <w:t>Umum</w:t>
+            </w:r>
+            <w:proofErr w:type="spellEnd"/>
           </w:p>
           <w:p>
             <w:pPr>
@@ -2205,7 +2250,7 @@
 </file>
 
 <file path=word/numbering.xml><?xml version="1.0" encoding="utf-8"?>
-<w:numbering xmlns:wpc="http://schemas.microsoft.com/office/word/2010/wordprocessingCanvas" xmlns:cx="http://schemas.microsoft.com/office/drawing/2014/chartex" xmlns:cx1="http://schemas.microsoft.com/office/drawing/2015/9/8/chartex" xmlns:cx2="http://schemas.microsoft.com/office/drawing/2015/10/21/chartex" xmlns:cx3="http://schemas.microsoft.com/office/drawing/2016/5/9/chartex" xmlns:cx4="http://schemas.microsoft.com/office/drawing/2016/5/10/chartex" xmlns:cx5="http://schemas.microsoft.com/office/drawing/2016/5/11/chartex" xmlns:cx6="http://schemas.microsoft.com/office/drawing/2016/5/12/chartex" xmlns:cx7="http://schemas.microsoft.com/office/drawing/2016/5/13/chartex" xmlns:cx8="http://schemas.microsoft.com/office/drawing/2016/5/14/chartex" xmlns:mc="http://schemas.openxmlformats.org/markup-compatibility/2006" xmlns:aink="http://schemas.microsoft.com/office/drawing/2016/ink" xmlns:am3d="http://schemas.microsoft.com/office/drawing/2017/model3d" xmlns:o="urn:schemas-microsoft-com:office:office" xmlns:r="http://schemas.openxmlformats.org/officeDocument/2006/relationships" xmlns:m="http://schemas.openxmlformats.org/officeDocument/2006/math" xmlns:v="urn:schemas-microsoft-com:vml" xmlns:wp14="http://schemas.microsoft.com/office/word/2010/wordprocessingDrawing" xmlns:wp="http://schemas.openxmlformats.org/drawingml/2006/wordprocessingDrawing" xmlns:w10="urn:schemas-microsoft-com:office:word" xmlns:w="http://schemas.openxmlformats.org/wordprocessingml/2006/main" xmlns:w14="http://schemas.microsoft.com/office/word/2010/wordml" xmlns:w15="http://schemas.microsoft.com/office/word/2012/wordml" xmlns:w16cid="http://schemas.microsoft.com/office/word/2016/wordml/cid" xmlns:w16se="http://schemas.microsoft.com/office/word/2015/wordml/symex" xmlns:wpg="http://schemas.microsoft.com/office/word/2010/wordprocessingGroup" xmlns:wpi="http://schemas.microsoft.com/office/word/2010/wordprocessingInk" xmlns:wne="http://schemas.microsoft.com/office/word/2006/wordml" xmlns:wps="http://schemas.microsoft.com/office/word/2010/wordprocessingShape" mc:Ignorable="w14 w15 w16se w16cid wp14">
+<w:numbering xmlns:wpc="http://schemas.microsoft.com/office/word/2010/wordprocessingCanvas" xmlns:cx="http://schemas.microsoft.com/office/drawing/2014/chartex" xmlns:cx1="http://schemas.microsoft.com/office/drawing/2015/9/8/chartex" xmlns:cx2="http://schemas.microsoft.com/office/drawing/2015/10/21/chartex" xmlns:cx3="http://schemas.microsoft.com/office/drawing/2016/5/9/chartex" xmlns:cx4="http://schemas.microsoft.com/office/drawing/2016/5/10/chartex" xmlns:cx5="http://schemas.microsoft.com/office/drawing/2016/5/11/chartex" xmlns:cx6="http://schemas.microsoft.com/office/drawing/2016/5/12/chartex" xmlns:cx7="http://schemas.microsoft.com/office/drawing/2016/5/13/chartex" xmlns:cx8="http://schemas.microsoft.com/office/drawing/2016/5/14/chartex" xmlns:mc="http://schemas.openxmlformats.org/markup-compatibility/2006" xmlns:aink="http://schemas.microsoft.com/office/drawing/2016/ink" xmlns:am3d="http://schemas.microsoft.com/office/drawing/2017/model3d" xmlns:o="urn:schemas-microsoft-com:office:office" xmlns:r="http://schemas.openxmlformats.org/officeDocument/2006/relationships" xmlns:m="http://schemas.openxmlformats.org/officeDocument/2006/math" xmlns:v="urn:schemas-microsoft-com:vml" xmlns:wp14="http://schemas.microsoft.com/office/word/2010/wordprocessingDrawing" xmlns:wp="http://schemas.openxmlformats.org/drawingml/2006/wordprocessingDrawing" xmlns:w10="urn:schemas-microsoft-com:office:word" xmlns:w="http://schemas.openxmlformats.org/wordprocessingml/2006/main" xmlns:w14="http://schemas.microsoft.com/office/word/2010/wordml" xmlns:w15="http://schemas.microsoft.com/office/word/2012/wordml" xmlns:w16cex="http://schemas.microsoft.com/office/word/2018/wordml/cex" xmlns:w16cid="http://schemas.microsoft.com/office/word/2016/wordml/cid" xmlns:w16="http://schemas.microsoft.com/office/word/2018/wordml" xmlns:w16sdtdh="http://schemas.microsoft.com/office/word/2020/wordml/sdtdatahash" xmlns:w16se="http://schemas.microsoft.com/office/word/2015/wordml/symex" xmlns:wpg="http://schemas.microsoft.com/office/word/2010/wordprocessingGroup" xmlns:wpi="http://schemas.microsoft.com/office/word/2010/wordprocessingInk" xmlns:wne="http://schemas.microsoft.com/office/word/2006/wordml" xmlns:wps="http://schemas.microsoft.com/office/word/2010/wordprocessingShape" mc:Ignorable="w14 w15 w16se w16cid w16 w16cex w16sdtdh wp14">
   <w:abstractNum w:abstractNumId="0" w15:restartNumberingAfterBreak="0">
     <w:nsid w:val="FFFFFF7C"/>
     <w:multiLevelType w:val="singleLevel"/>
@@ -2435,17 +2480,17 @@
 </file>
 
 <file path=word/styles.xml><?xml version="1.0" encoding="utf-8"?>
-<w:styles xmlns:mc="http://schemas.openxmlformats.org/markup-compatibility/2006" xmlns:r="http://schemas.openxmlformats.org/officeDocument/2006/relationships" xmlns:w="http://schemas.openxmlformats.org/wordprocessingml/2006/main" xmlns:w14="http://schemas.microsoft.com/office/word/2010/wordml" xmlns:w15="http://schemas.microsoft.com/office/word/2012/wordml" xmlns:w16cid="http://schemas.microsoft.com/office/word/2016/wordml/cid" xmlns:w16se="http://schemas.microsoft.com/office/word/2015/wordml/symex" mc:Ignorable="w14 w15 w16se w16cid">
+<w:styles xmlns:mc="http://schemas.openxmlformats.org/markup-compatibility/2006" xmlns:r="http://schemas.openxmlformats.org/officeDocument/2006/relationships" xmlns:w="http://schemas.openxmlformats.org/wordprocessingml/2006/main" xmlns:w14="http://schemas.microsoft.com/office/word/2010/wordml" xmlns:w15="http://schemas.microsoft.com/office/word/2012/wordml" xmlns:w16cex="http://schemas.microsoft.com/office/word/2018/wordml/cex" xmlns:w16cid="http://schemas.microsoft.com/office/word/2016/wordml/cid" xmlns:w16="http://schemas.microsoft.com/office/word/2018/wordml" xmlns:w16sdtdh="http://schemas.microsoft.com/office/word/2020/wordml/sdtdatahash" xmlns:w16se="http://schemas.microsoft.com/office/word/2015/wordml/symex" mc:Ignorable="w14 w15 w16se w16cid w16 w16cex w16sdtdh">
   <w:docDefaults>
     <w:rPrDefault>
       <w:rPr>
         <w:rFonts w:ascii="Times New Roman" w:eastAsia="SimSun" w:hAnsi="Times New Roman" w:cs="Times New Roman"/>
-        <w:lang w:val="en-ID" w:eastAsia="en-ID" w:bidi="ar-SA"/>
+        <w:lang w:val="en-US" w:eastAsia="en-US" w:bidi="ar-SA"/>
       </w:rPr>
     </w:rPrDefault>
     <w:pPrDefault/>
   </w:docDefaults>
-  <w:latentStyles w:defLockedState="0" w:defUIPriority="0" w:defSemiHidden="0" w:defUnhideWhenUsed="0" w:defQFormat="0" w:count="375">
+  <w:latentStyles w:defLockedState="0" w:defUIPriority="0" w:defSemiHidden="0" w:defUnhideWhenUsed="0" w:defQFormat="0" w:count="376">
     <w:lsdException w:name="Normal" w:qFormat="1"/>
     <w:lsdException w:name="heading 1" w:qFormat="1"/>
     <w:lsdException w:name="heading 2" w:qFormat="1"/>
@@ -2479,6 +2524,7 @@
     <w:lsdException w:name="HTML Bottom of Form" w:semiHidden="1" w:uiPriority="99" w:unhideWhenUsed="1"/>
     <w:lsdException w:name="HTML Address" w:qFormat="1"/>
     <w:lsdException w:name="HTML Cite" w:qFormat="1"/>
+    <w:lsdException w:name="HTML Variable" w:semiHidden="1" w:unhideWhenUsed="1"/>
     <w:lsdException w:name="Normal Table" w:semiHidden="1" w:unhideWhenUsed="1" w:qFormat="1"/>
     <w:lsdException w:name="No List" w:semiHidden="1" w:uiPriority="99" w:unhideWhenUsed="1"/>
     <w:lsdException w:name="Outline List 1" w:semiHidden="1" w:uiPriority="99" w:unhideWhenUsed="1"/>
@@ -2526,6 +2572,7 @@
     <w:lsdException w:name="Table Web 1" w:semiHidden="1" w:unhideWhenUsed="1"/>
     <w:lsdException w:name="Table Web 2" w:semiHidden="1" w:unhideWhenUsed="1"/>
     <w:lsdException w:name="Table Web 3" w:semiHidden="1" w:unhideWhenUsed="1"/>
+    <w:lsdException w:name="Balloon Text" w:semiHidden="1" w:unhideWhenUsed="1"/>
     <w:lsdException w:name="Table Theme" w:semiHidden="1" w:unhideWhenUsed="1"/>
     <w:lsdException w:name="Placeholder Text" w:semiHidden="1" w:uiPriority="99" w:unhideWhenUsed="1"/>
     <w:lsdException w:name="No Spacing" w:uiPriority="99" w:qFormat="1"/>
@@ -2746,6 +2793,7 @@
     <w:lsdException w:name="Smart Hyperlink" w:semiHidden="1" w:uiPriority="99" w:unhideWhenUsed="1"/>
     <w:lsdException w:name="Hashtag" w:semiHidden="1" w:uiPriority="99" w:unhideWhenUsed="1"/>
     <w:lsdException w:name="Unresolved Mention" w:semiHidden="1" w:uiPriority="99" w:unhideWhenUsed="1"/>
+    <w:lsdException w:name="Smart Link" w:semiHidden="1" w:uiPriority="99" w:unhideWhenUsed="1"/>
   </w:latentStyles>
   <w:style w:type="paragraph" w:default="1" w:styleId="Normal">
     <w:name w:val="Normal"/>
@@ -2754,7 +2802,7 @@
       <w:rFonts w:eastAsia="Times New Roman"/>
       <w:sz w:val="24"/>
       <w:szCs w:val="24"/>
-      <w:lang w:val="id-ID" w:eastAsia="en-US"/>
+      <w:lang w:val="id-ID"/>
     </w:rPr>
   </w:style>
   <w:style w:type="paragraph" w:styleId="Heading1">
@@ -3564,7 +3612,7 @@
       <w:kern w:val="2"/>
       <w:sz w:val="24"/>
       <w:szCs w:val="24"/>
-      <w:lang w:val="en-US" w:eastAsia="zh-CN"/>
+      <w:lang w:eastAsia="zh-CN"/>
     </w:rPr>
   </w:style>
   <w:style w:type="paragraph" w:styleId="MessageHeader">

</xml_diff>

<commit_message>
perubahan kodingan ke 32
</commit_message>
<xml_diff>
--- a/writable/templates/template_p37.docx
+++ b/writable/templates/template_p37.docx
@@ -52,7 +52,6 @@
         </w:rPr>
         <w:t>{</w:t>
       </w:r>
-      <w:proofErr w:type="spellStart"/>
       <w:r>
         <w:rPr>
           <w:b/>
@@ -80,7 +79,6 @@
         </w:rPr>
         <w:t>nstansi</w:t>
       </w:r>
-      <w:proofErr w:type="spellEnd"/>
       <w:r>
         <w:rPr>
           <w:b/>
@@ -192,147 +190,18 @@
         <w:ind w:firstLine="900"/>
         <w:jc w:val="both"/>
       </w:pPr>
-      <w:proofErr w:type="spellStart"/>
       <w:r>
         <w:rPr>
           <w:lang w:val="en-US"/>
         </w:rPr>
-        <w:t>Untuk</w:t>
+        <w:t xml:space="preserve">Untuk melaksanakan surat Penetapan Hakim Pengadilan Negeri BOYOLALI, sehubungan dengan perkara tindak </w:t>
       </w:r>
-      <w:proofErr w:type="spellEnd"/>
-      <w:r>
-        <w:rPr>
-          <w:lang w:val="en-US"/>
-        </w:rPr>
-        <w:t xml:space="preserve"> </w:t>
-      </w:r>
-      <w:proofErr w:type="spellStart"/>
-      <w:r>
-        <w:rPr>
-          <w:lang w:val="en-US"/>
-        </w:rPr>
-        <w:t>melaksanakan</w:t>
-      </w:r>
-      <w:proofErr w:type="spellEnd"/>
-      <w:r>
-        <w:rPr>
-          <w:lang w:val="en-US"/>
-        </w:rPr>
-        <w:t xml:space="preserve"> </w:t>
-      </w:r>
-      <w:proofErr w:type="spellStart"/>
-      <w:r>
-        <w:rPr>
-          <w:lang w:val="en-US"/>
-        </w:rPr>
-        <w:t>surat</w:t>
-      </w:r>
-      <w:proofErr w:type="spellEnd"/>
-      <w:r>
-        <w:rPr>
-          <w:lang w:val="en-US"/>
-        </w:rPr>
-        <w:t xml:space="preserve"> </w:t>
-      </w:r>
-      <w:proofErr w:type="spellStart"/>
-      <w:r>
-        <w:rPr>
-          <w:lang w:val="en-US"/>
-        </w:rPr>
-        <w:t>Penetapan</w:t>
-      </w:r>
-      <w:proofErr w:type="spellEnd"/>
-      <w:r>
-        <w:rPr>
-          <w:lang w:val="en-US"/>
-        </w:rPr>
-        <w:t xml:space="preserve"> Hakim </w:t>
-      </w:r>
-      <w:proofErr w:type="spellStart"/>
-      <w:r>
-        <w:rPr>
-          <w:lang w:val="en-US"/>
-        </w:rPr>
-        <w:t>Pengadilan</w:t>
-      </w:r>
-      <w:proofErr w:type="spellEnd"/>
-      <w:r>
-        <w:rPr>
-          <w:lang w:val="en-US"/>
-        </w:rPr>
-        <w:t xml:space="preserve"> Negeri BOYOLALI, </w:t>
-      </w:r>
-      <w:proofErr w:type="spellStart"/>
-      <w:r>
-        <w:rPr>
-          <w:lang w:val="en-US"/>
-        </w:rPr>
-        <w:t>sehubungan</w:t>
-      </w:r>
-      <w:proofErr w:type="spellEnd"/>
-      <w:r>
-        <w:rPr>
-          <w:lang w:val="en-US"/>
-        </w:rPr>
-        <w:t xml:space="preserve"> </w:t>
-      </w:r>
-      <w:proofErr w:type="spellStart"/>
-      <w:r>
-        <w:rPr>
-          <w:lang w:val="en-US"/>
-        </w:rPr>
-        <w:t>dengan</w:t>
-      </w:r>
-      <w:proofErr w:type="spellEnd"/>
-      <w:r>
-        <w:rPr>
-          <w:lang w:val="en-US"/>
-        </w:rPr>
-        <w:t xml:space="preserve"> </w:t>
-      </w:r>
-      <w:proofErr w:type="spellStart"/>
-      <w:r>
-        <w:rPr>
-          <w:lang w:val="en-US"/>
-        </w:rPr>
-        <w:t>perkara</w:t>
-      </w:r>
-      <w:proofErr w:type="spellEnd"/>
-      <w:r>
-        <w:rPr>
-          <w:lang w:val="en-US"/>
-        </w:rPr>
-        <w:t xml:space="preserve"> </w:t>
-      </w:r>
-      <w:proofErr w:type="spellStart"/>
-      <w:r>
-        <w:rPr>
-          <w:lang w:val="en-US"/>
-        </w:rPr>
-        <w:t>tindak</w:t>
-      </w:r>
-      <w:proofErr w:type="spellEnd"/>
-      <w:r>
-        <w:rPr>
-          <w:lang w:val="en-US"/>
-        </w:rPr>
-        <w:t xml:space="preserve"> </w:t>
-      </w:r>
-      <w:proofErr w:type="spellStart"/>
       <w:r>
         <w:rPr>
           <w:b/>
           <w:lang w:val="en-US"/>
         </w:rPr>
-        <w:t>Pidana</w:t>
-      </w:r>
-      <w:proofErr w:type="spellEnd"/>
-      <w:r>
-        <w:rPr>
-          <w:b/>
-          <w:lang w:val="en-US"/>
-        </w:rPr>
-        <w:t xml:space="preserve"> </w:t>
+        <w:t xml:space="preserve">Pidana </w:t>
       </w:r>
       <w:r>
         <w:rPr>
@@ -341,7 +210,6 @@
         </w:rPr>
         <w:t>${</w:t>
       </w:r>
-      <w:proofErr w:type="spellStart"/>
       <w:r>
         <w:rPr>
           <w:b/>
@@ -349,7 +217,6 @@
         </w:rPr>
         <w:t>jenis_perkara</w:t>
       </w:r>
-      <w:proofErr w:type="spellEnd"/>
       <w:r>
         <w:rPr>
           <w:b/>
@@ -368,86 +235,8 @@
         <w:rPr>
           <w:lang w:val="en-US"/>
         </w:rPr>
-        <w:t xml:space="preserve"> </w:t>
+        <w:t xml:space="preserve"> dengan acara pemeriksaan biasa atas nama terdakwa</w:t>
       </w:r>
-      <w:proofErr w:type="spellStart"/>
-      <w:r>
-        <w:rPr>
-          <w:lang w:val="en-US"/>
-        </w:rPr>
-        <w:t>dengan</w:t>
-      </w:r>
-      <w:proofErr w:type="spellEnd"/>
-      <w:r>
-        <w:rPr>
-          <w:lang w:val="en-US"/>
-        </w:rPr>
-        <w:t xml:space="preserve"> acara </w:t>
-      </w:r>
-      <w:proofErr w:type="spellStart"/>
-      <w:r>
-        <w:rPr>
-          <w:lang w:val="en-US"/>
-        </w:rPr>
-        <w:t>pemeriksaan</w:t>
-      </w:r>
-      <w:proofErr w:type="spellEnd"/>
-      <w:r>
-        <w:rPr>
-          <w:lang w:val="en-US"/>
-        </w:rPr>
-        <w:t xml:space="preserve"> </w:t>
-      </w:r>
-      <w:proofErr w:type="spellStart"/>
-      <w:r>
-        <w:rPr>
-          <w:lang w:val="en-US"/>
-        </w:rPr>
-        <w:t>biasa</w:t>
-      </w:r>
-      <w:proofErr w:type="spellEnd"/>
-      <w:r>
-        <w:rPr>
-          <w:lang w:val="en-US"/>
-        </w:rPr>
-        <w:t xml:space="preserve"> </w:t>
-      </w:r>
-      <w:proofErr w:type="spellStart"/>
-      <w:r>
-        <w:rPr>
-          <w:lang w:val="en-US"/>
-        </w:rPr>
-        <w:t>atas</w:t>
-      </w:r>
-      <w:proofErr w:type="spellEnd"/>
-      <w:r>
-        <w:rPr>
-          <w:lang w:val="en-US"/>
-        </w:rPr>
-        <w:t xml:space="preserve"> </w:t>
-      </w:r>
-      <w:proofErr w:type="spellStart"/>
-      <w:r>
-        <w:rPr>
-          <w:lang w:val="en-US"/>
-        </w:rPr>
-        <w:t>nama</w:t>
-      </w:r>
-      <w:proofErr w:type="spellEnd"/>
-      <w:r>
-        <w:rPr>
-          <w:lang w:val="en-US"/>
-        </w:rPr>
-        <w:t xml:space="preserve"> </w:t>
-      </w:r>
-      <w:proofErr w:type="spellStart"/>
-      <w:r>
-        <w:rPr>
-          <w:lang w:val="en-US"/>
-        </w:rPr>
-        <w:t>terdakwa</w:t>
-      </w:r>
-      <w:proofErr w:type="spellEnd"/>
       <w:r>
         <w:rPr>
           <w:b/>
@@ -463,27 +252,7 @@
           <w:color w:val="000000"/>
           <w:lang w:val="en-US"/>
         </w:rPr>
-        <w:t>${</w:t>
-      </w:r>
-      <w:proofErr w:type="spellStart"/>
-      <w:r>
-        <w:rPr>
-          <w:b/>
-          <w:bCs/>
-          <w:color w:val="000000"/>
-          <w:lang w:val="en-US"/>
-        </w:rPr>
-        <w:t>nama_terdakwa</w:t>
-      </w:r>
-      <w:proofErr w:type="spellEnd"/>
-      <w:r>
-        <w:rPr>
-          <w:b/>
-          <w:bCs/>
-          <w:color w:val="000000"/>
-          <w:lang w:val="en-US"/>
-        </w:rPr>
-        <w:t>}</w:t>
+        <w:t>${nama_terdakwa}</w:t>
       </w:r>
       <w:r>
         <w:rPr>
@@ -511,7 +280,6 @@
         </w:rPr>
         <w:t>{</w:t>
       </w:r>
-      <w:proofErr w:type="spellStart"/>
       <w:r>
         <w:rPr>
           <w:b/>
@@ -521,7 +289,6 @@
         </w:rPr>
         <w:t>nama_ortu</w:t>
       </w:r>
-      <w:proofErr w:type="spellEnd"/>
       <w:r>
         <w:rPr>
           <w:b/>
@@ -540,103 +307,11 @@
         </w:rPr>
         <w:t xml:space="preserve"> </w:t>
       </w:r>
-      <w:proofErr w:type="spellStart"/>
       <w:r>
         <w:rPr>
           <w:lang w:val="en-US"/>
         </w:rPr>
-        <w:t>Untuk</w:t>
-      </w:r>
-      <w:proofErr w:type="spellEnd"/>
-      <w:r>
-        <w:rPr>
-          <w:lang w:val="en-US"/>
-        </w:rPr>
-        <w:t xml:space="preserve"> </w:t>
-      </w:r>
-      <w:proofErr w:type="spellStart"/>
-      <w:r>
-        <w:rPr>
-          <w:lang w:val="en-US"/>
-        </w:rPr>
-        <w:t>keperluan</w:t>
-      </w:r>
-      <w:proofErr w:type="spellEnd"/>
-      <w:r>
-        <w:rPr>
-          <w:lang w:val="en-US"/>
-        </w:rPr>
-        <w:t xml:space="preserve"> </w:t>
-      </w:r>
-      <w:proofErr w:type="spellStart"/>
-      <w:r>
-        <w:rPr>
-          <w:lang w:val="en-US"/>
-        </w:rPr>
-        <w:t>persidangan</w:t>
-      </w:r>
-      <w:proofErr w:type="spellEnd"/>
-      <w:r>
-        <w:rPr>
-          <w:lang w:val="en-US"/>
-        </w:rPr>
-        <w:t xml:space="preserve"> </w:t>
-      </w:r>
-      <w:proofErr w:type="spellStart"/>
-      <w:r>
-        <w:rPr>
-          <w:lang w:val="en-US"/>
-        </w:rPr>
-        <w:t>diminta</w:t>
-      </w:r>
-      <w:proofErr w:type="spellEnd"/>
-      <w:r>
-        <w:rPr>
-          <w:lang w:val="en-US"/>
-        </w:rPr>
-        <w:t xml:space="preserve"> agar </w:t>
-      </w:r>
-      <w:proofErr w:type="spellStart"/>
-      <w:r>
-        <w:rPr>
-          <w:lang w:val="en-US"/>
-        </w:rPr>
-        <w:t>Saudara</w:t>
-      </w:r>
-      <w:proofErr w:type="spellEnd"/>
-      <w:r>
-        <w:rPr>
-          <w:lang w:val="en-US"/>
-        </w:rPr>
-        <w:t xml:space="preserve"> </w:t>
-      </w:r>
-      <w:proofErr w:type="spellStart"/>
-      <w:r>
-        <w:rPr>
-          <w:lang w:val="en-US"/>
-        </w:rPr>
-        <w:t>memberikan</w:t>
-      </w:r>
-      <w:proofErr w:type="spellEnd"/>
-      <w:r>
-        <w:rPr>
-          <w:lang w:val="en-US"/>
-        </w:rPr>
-        <w:t xml:space="preserve"> </w:t>
-      </w:r>
-      <w:proofErr w:type="spellStart"/>
-      <w:r>
-        <w:rPr>
-          <w:lang w:val="en-US"/>
-        </w:rPr>
-        <w:t>keterangan</w:t>
-      </w:r>
-      <w:proofErr w:type="spellEnd"/>
-      <w:r>
-        <w:rPr>
-          <w:lang w:val="en-US"/>
-        </w:rPr>
-        <w:t>.</w:t>
+        <w:t>Untuk keperluan persidangan diminta agar Saudara memberikan keterangan.</w:t>
       </w:r>
     </w:p>
     <w:p>
@@ -705,7 +380,6 @@
             <w:r>
               <w:t>${</w:t>
             </w:r>
-            <w:proofErr w:type="spellStart"/>
             <w:r>
               <w:rPr>
                 <w:b/>
@@ -715,7 +389,6 @@
               </w:rPr>
               <w:t>nama_terdakwa</w:t>
             </w:r>
-            <w:proofErr w:type="spellEnd"/>
             <w:r>
               <w:t>}</w:t>
             </w:r>
@@ -789,21 +462,7 @@
               <w:rPr>
                 <w:lang w:val="en-US"/>
               </w:rPr>
-              <w:t>${</w:t>
-            </w:r>
-            <w:proofErr w:type="spellStart"/>
-            <w:r>
-              <w:rPr>
-                <w:lang w:val="en-US"/>
-              </w:rPr>
-              <w:t>tempat_lahir</w:t>
-            </w:r>
-            <w:proofErr w:type="spellEnd"/>
-            <w:r>
-              <w:rPr>
-                <w:lang w:val="en-US"/>
-              </w:rPr>
-              <w:t>}</w:t>
+              <w:t>${tempat_lahir}</w:t>
             </w:r>
           </w:p>
         </w:tc>
@@ -823,33 +482,11 @@
             </w:tcMar>
           </w:tcPr>
           <w:p>
-            <w:proofErr w:type="spellStart"/>
             <w:r>
               <w:rPr>
                 <w:lang w:val="en-US"/>
               </w:rPr>
-              <w:t>Umur</w:t>
-            </w:r>
-            <w:proofErr w:type="spellEnd"/>
-            <w:r>
-              <w:rPr>
-                <w:lang w:val="en-US"/>
-              </w:rPr>
-              <w:t xml:space="preserve"> / </w:t>
-            </w:r>
-            <w:proofErr w:type="spellStart"/>
-            <w:r>
-              <w:rPr>
-                <w:lang w:val="en-US"/>
-              </w:rPr>
-              <w:t>Tgl</w:t>
-            </w:r>
-            <w:proofErr w:type="spellEnd"/>
-            <w:r>
-              <w:rPr>
-                <w:lang w:val="en-US"/>
-              </w:rPr>
-              <w:t xml:space="preserve"> Lahir</w:t>
+              <w:t>Umur / Tgl Lahir</w:t>
             </w:r>
           </w:p>
         </w:tc>
@@ -892,21 +529,7 @@
               <w:rPr>
                 <w:lang w:val="en-US"/>
               </w:rPr>
-              <w:t>${</w:t>
-            </w:r>
-            <w:proofErr w:type="spellStart"/>
-            <w:r>
-              <w:rPr>
-                <w:lang w:val="en-US"/>
-              </w:rPr>
-              <w:t>umur</w:t>
-            </w:r>
-            <w:proofErr w:type="spellEnd"/>
-            <w:r>
-              <w:rPr>
-                <w:lang w:val="en-US"/>
-              </w:rPr>
-              <w:t>}</w:t>
+              <w:t>${umur}</w:t>
             </w:r>
             <w:r>
               <w:rPr>
@@ -914,39 +537,17 @@
               </w:rPr>
               <w:t xml:space="preserve"> </w:t>
             </w:r>
-            <w:proofErr w:type="spellStart"/>
             <w:r>
               <w:rPr>
                 <w:lang w:val="en-US"/>
               </w:rPr>
-              <w:t>Tahun</w:t>
-            </w:r>
-            <w:proofErr w:type="spellEnd"/>
-            <w:r>
-              <w:rPr>
-                <w:lang w:val="en-US"/>
-              </w:rPr>
-              <w:t xml:space="preserve"> / </w:t>
+              <w:t xml:space="preserve">Tahun / </w:t>
             </w:r>
             <w:r>
               <w:rPr>
                 <w:lang w:val="en-US"/>
               </w:rPr>
-              <w:t>${</w:t>
-            </w:r>
-            <w:proofErr w:type="spellStart"/>
-            <w:r>
-              <w:rPr>
-                <w:lang w:val="en-US"/>
-              </w:rPr>
-              <w:t>tgl_lahir</w:t>
-            </w:r>
-            <w:proofErr w:type="spellEnd"/>
-            <w:r>
-              <w:rPr>
-                <w:lang w:val="en-US"/>
-              </w:rPr>
-              <w:t>}</w:t>
+              <w:t>${tgl_lahir}</w:t>
             </w:r>
           </w:p>
         </w:tc>
@@ -1007,21 +608,7 @@
               <w:rPr>
                 <w:lang w:val="en-US"/>
               </w:rPr>
-              <w:t>${</w:t>
-            </w:r>
-            <w:proofErr w:type="spellStart"/>
-            <w:r>
-              <w:rPr>
-                <w:lang w:val="en-US"/>
-              </w:rPr>
-              <w:t>jenis_kelamin</w:t>
-            </w:r>
-            <w:proofErr w:type="spellEnd"/>
-            <w:r>
-              <w:rPr>
-                <w:lang w:val="en-US"/>
-              </w:rPr>
-              <w:t>}</w:t>
+              <w:t>${jenis_kelamin}</w:t>
             </w:r>
           </w:p>
         </w:tc>
@@ -1085,21 +672,7 @@
               <w:rPr>
                 <w:lang w:val="en-US"/>
               </w:rPr>
-              <w:t>${</w:t>
-            </w:r>
-            <w:proofErr w:type="spellStart"/>
-            <w:r>
-              <w:rPr>
-                <w:lang w:val="en-US"/>
-              </w:rPr>
-              <w:t>kewarganegaraan</w:t>
-            </w:r>
-            <w:proofErr w:type="spellEnd"/>
-            <w:r>
-              <w:rPr>
-                <w:lang w:val="en-US"/>
-              </w:rPr>
-              <w:t>}</w:t>
+              <w:t>${kewarganegaraan}</w:t>
             </w:r>
           </w:p>
         </w:tc>
@@ -1160,21 +733,7 @@
               <w:rPr>
                 <w:lang w:val="en-US"/>
               </w:rPr>
-              <w:t>${</w:t>
-            </w:r>
-            <w:proofErr w:type="spellStart"/>
-            <w:r>
-              <w:rPr>
-                <w:lang w:val="en-US"/>
-              </w:rPr>
-              <w:t>alamat</w:t>
-            </w:r>
-            <w:proofErr w:type="spellEnd"/>
-            <w:r>
-              <w:rPr>
-                <w:lang w:val="en-US"/>
-              </w:rPr>
-              <w:t>}</w:t>
+              <w:t>${alamat}</w:t>
             </w:r>
           </w:p>
         </w:tc>
@@ -1291,21 +850,7 @@
               <w:rPr>
                 <w:lang w:val="en-US"/>
               </w:rPr>
-              <w:t>${</w:t>
-            </w:r>
-            <w:proofErr w:type="spellStart"/>
-            <w:r>
-              <w:rPr>
-                <w:lang w:val="en-US"/>
-              </w:rPr>
-              <w:t>pekerjaan</w:t>
-            </w:r>
-            <w:proofErr w:type="spellEnd"/>
-            <w:r>
-              <w:rPr>
-                <w:lang w:val="en-US"/>
-              </w:rPr>
-              <w:t>}</w:t>
+              <w:t>${pekerjaan}</w:t>
             </w:r>
           </w:p>
         </w:tc>
@@ -1363,7 +908,6 @@
               </w:rPr>
               <w:t>${</w:t>
             </w:r>
-            <w:proofErr w:type="spellStart"/>
             <w:r>
               <w:rPr>
                 <w:lang w:val="en-US"/>
@@ -1374,14 +918,7 @@
               <w:rPr>
                 <w:lang w:val="en-US"/>
               </w:rPr>
-              <w:t>endidikan</w:t>
-            </w:r>
-            <w:proofErr w:type="spellEnd"/>
-            <w:r>
-              <w:rPr>
-                <w:lang w:val="en-US"/>
-              </w:rPr>
-              <w:t>}</w:t>
+              <w:t>endidikan}</w:t>
             </w:r>
           </w:p>
         </w:tc>
@@ -1478,21 +1015,7 @@
               <w:rPr>
                 <w:lang w:val="en-US"/>
               </w:rPr>
-              <w:t>${</w:t>
-            </w:r>
-            <w:proofErr w:type="spellStart"/>
-            <w:r>
-              <w:rPr>
-                <w:lang w:val="en-US"/>
-              </w:rPr>
-              <w:t>jpu</w:t>
-            </w:r>
-            <w:proofErr w:type="spellEnd"/>
-            <w:r>
-              <w:rPr>
-                <w:lang w:val="en-US"/>
-              </w:rPr>
-              <w:t>}</w:t>
+              <w:t>${jpu}</w:t>
             </w:r>
           </w:p>
         </w:tc>
@@ -1544,28 +1067,12 @@
             </w:tcMar>
           </w:tcPr>
           <w:p>
-            <w:proofErr w:type="spellStart"/>
             <w:r>
               <w:rPr>
                 <w:lang w:val="en-US"/>
               </w:rPr>
-              <w:t>Pengadilan</w:t>
+              <w:t>Pengadilan Negeri Boyolali</w:t>
             </w:r>
-            <w:proofErr w:type="spellEnd"/>
-            <w:r>
-              <w:rPr>
-                <w:lang w:val="en-US"/>
-              </w:rPr>
-              <w:t xml:space="preserve"> Negeri </w:t>
-            </w:r>
-            <w:proofErr w:type="spellStart"/>
-            <w:r>
-              <w:rPr>
-                <w:lang w:val="en-US"/>
-              </w:rPr>
-              <w:t>Boyolali</w:t>
-            </w:r>
-            <w:proofErr w:type="spellEnd"/>
           </w:p>
         </w:tc>
       </w:tr>
@@ -1634,21 +1141,7 @@
               <w:rPr>
                 <w:lang w:val="en-US"/>
               </w:rPr>
-              <w:t>${</w:t>
-            </w:r>
-            <w:proofErr w:type="spellStart"/>
-            <w:r>
-              <w:rPr>
-                <w:lang w:val="en-US"/>
-              </w:rPr>
-              <w:t>hari_sidang</w:t>
-            </w:r>
-            <w:proofErr w:type="spellEnd"/>
-            <w:r>
-              <w:rPr>
-                <w:lang w:val="en-US"/>
-              </w:rPr>
-              <w:t>}</w:t>
+              <w:t>${hari_sidang}</w:t>
             </w:r>
           </w:p>
         </w:tc>
@@ -1713,16 +1206,8 @@
               <w:rPr>
                 <w:lang w:val="en-US"/>
               </w:rPr>
-              <w:t xml:space="preserve">WIB – </w:t>
+              <w:t>WIB – Selesai</w:t>
             </w:r>
-            <w:proofErr w:type="spellStart"/>
-            <w:r>
-              <w:rPr>
-                <w:lang w:val="en-US"/>
-              </w:rPr>
-              <w:t>Selesai</w:t>
-            </w:r>
-            <w:proofErr w:type="spellEnd"/>
           </w:p>
         </w:tc>
       </w:tr>
@@ -1741,28 +1226,12 @@
             </w:tcMar>
           </w:tcPr>
           <w:p>
-            <w:proofErr w:type="spellStart"/>
             <w:r>
               <w:rPr>
                 <w:lang w:val="en-US"/>
               </w:rPr>
-              <w:t>Untuk</w:t>
+              <w:t>Untuk Keperluan</w:t>
             </w:r>
-            <w:proofErr w:type="spellEnd"/>
-            <w:r>
-              <w:rPr>
-                <w:lang w:val="en-US"/>
-              </w:rPr>
-              <w:t xml:space="preserve"> </w:t>
-            </w:r>
-            <w:proofErr w:type="spellStart"/>
-            <w:r>
-              <w:rPr>
-                <w:lang w:val="en-US"/>
-              </w:rPr>
-              <w:t>Keperluan</w:t>
-            </w:r>
-            <w:proofErr w:type="spellEnd"/>
           </w:p>
         </w:tc>
         <w:tc>
@@ -1800,14 +1269,12 @@
                 <w:lang w:val="en-US"/>
               </w:rPr>
             </w:pPr>
-            <w:proofErr w:type="spellStart"/>
             <w:r>
               <w:rPr>
                 <w:lang w:val="en-US"/>
               </w:rPr>
               <w:t>Persidangan</w:t>
             </w:r>
-            <w:proofErr w:type="spellEnd"/>
             <w:r>
               <w:t xml:space="preserve"> Dengan Agenda </w:t>
             </w:r>
@@ -1928,14 +1395,12 @@
             <w:pPr>
               <w:jc w:val="center"/>
             </w:pPr>
-            <w:proofErr w:type="spellStart"/>
             <w:r>
               <w:rPr>
                 <w:lang w:val="en-US"/>
               </w:rPr>
               <w:t>Terdakwa</w:t>
             </w:r>
-            <w:proofErr w:type="spellEnd"/>
           </w:p>
           <w:p/>
           <w:p/>
@@ -1946,7 +1411,6 @@
               <w:ind w:left="-108"/>
               <w:jc w:val="center"/>
             </w:pPr>
-            <w:proofErr w:type="gramStart"/>
             <w:r>
               <w:rPr>
                 <w:b/>
@@ -1961,34 +1425,7 @@
                 <w:bCs/>
                 <w:lang w:val="en-US"/>
               </w:rPr>
-              <w:t xml:space="preserve"> $</w:t>
-            </w:r>
-            <w:proofErr w:type="gramEnd"/>
-            <w:r>
-              <w:rPr>
-                <w:b/>
-                <w:bCs/>
-                <w:lang w:val="en-US"/>
-              </w:rPr>
-              <w:t>{</w:t>
-            </w:r>
-            <w:proofErr w:type="spellStart"/>
-            <w:r>
-              <w:rPr>
-                <w:b/>
-                <w:bCs/>
-                <w:lang w:val="en-US"/>
-              </w:rPr>
-              <w:t>nama_terdakwa</w:t>
-            </w:r>
-            <w:proofErr w:type="spellEnd"/>
-            <w:r>
-              <w:rPr>
-                <w:b/>
-                <w:bCs/>
-                <w:lang w:val="en-US"/>
-              </w:rPr>
-              <w:t xml:space="preserve">} </w:t>
+              <w:t xml:space="preserve"> ${nama_terdakwa} </w:t>
             </w:r>
             <w:r>
               <w:rPr>
@@ -2031,21 +1468,7 @@
               <w:rPr>
                 <w:lang w:val="en-US"/>
               </w:rPr>
-              <w:t>${</w:t>
-            </w:r>
-            <w:proofErr w:type="spellStart"/>
-            <w:r>
-              <w:rPr>
-                <w:lang w:val="en-US"/>
-              </w:rPr>
-              <w:t>tanggal_surat</w:t>
-            </w:r>
-            <w:proofErr w:type="spellEnd"/>
-            <w:r>
-              <w:rPr>
-                <w:lang w:val="en-US"/>
-              </w:rPr>
-              <w:t>}</w:t>
+              <w:t>${tanggal_surat}</w:t>
             </w:r>
           </w:p>
           <w:p>
@@ -2063,25 +1486,23 @@
                 <w:bCs/>
                 <w:lang w:val="en-US"/>
               </w:rPr>
-              <w:t xml:space="preserve">A.N </w:t>
+              <w:t>A.</w:t>
             </w:r>
-            <w:proofErr w:type="spellStart"/>
             <w:r>
               <w:rPr>
                 <w:b/>
                 <w:bCs/>
                 <w:lang w:val="en-US"/>
               </w:rPr>
-              <w:t>Kepala</w:t>
+              <w:t>n</w:t>
             </w:r>
-            <w:proofErr w:type="spellEnd"/>
             <w:r>
               <w:rPr>
                 <w:b/>
                 <w:bCs/>
                 <w:lang w:val="en-US"/>
               </w:rPr>
-              <w:t xml:space="preserve"> </w:t>
+              <w:t xml:space="preserve"> Kepala </w:t>
             </w:r>
             <w:r>
               <w:rPr>
@@ -2129,16 +1550,22 @@
             <w:pPr>
               <w:jc w:val="center"/>
             </w:pPr>
-            <w:proofErr w:type="spellStart"/>
             <w:r>
               <w:rPr>
                 <w:b/>
                 <w:bCs/>
                 <w:lang w:val="en-US"/>
               </w:rPr>
-              <w:t>Ub</w:t>
+              <w:t>U</w:t>
             </w:r>
-            <w:proofErr w:type="spellEnd"/>
+            <w:r>
+              <w:rPr>
+                <w:b/>
+                <w:bCs/>
+                <w:lang w:val="en-US"/>
+              </w:rPr>
+              <w:t>p</w:t>
+            </w:r>
             <w:r>
               <w:rPr>
                 <w:b/>
@@ -2147,34 +1574,14 @@
               </w:rPr>
               <w:t xml:space="preserve">. </w:t>
             </w:r>
-            <w:proofErr w:type="spellStart"/>
             <w:r>
               <w:rPr>
                 <w:b/>
                 <w:bCs/>
                 <w:lang w:val="en-US"/>
               </w:rPr>
-              <w:t>Penuntut</w:t>
+              <w:t>Penuntut Umum</w:t>
             </w:r>
-            <w:proofErr w:type="spellEnd"/>
-            <w:r>
-              <w:rPr>
-                <w:b/>
-                <w:bCs/>
-                <w:lang w:val="en-US"/>
-              </w:rPr>
-              <w:t xml:space="preserve"> </w:t>
-            </w:r>
-            <w:proofErr w:type="spellStart"/>
-            <w:r>
-              <w:rPr>
-                <w:b/>
-                <w:bCs/>
-                <w:lang w:val="en-US"/>
-              </w:rPr>
-              <w:t>Umum</w:t>
-            </w:r>
-            <w:proofErr w:type="spellEnd"/>
           </w:p>
           <w:p>
             <w:pPr>
@@ -2205,27 +1612,7 @@
                 <w:u w:val="single"/>
                 <w:lang w:val="en-US"/>
               </w:rPr>
-              <w:t>${</w:t>
-            </w:r>
-            <w:proofErr w:type="spellStart"/>
-            <w:r>
-              <w:rPr>
-                <w:b/>
-                <w:bCs/>
-                <w:u w:val="single"/>
-                <w:lang w:val="en-US"/>
-              </w:rPr>
-              <w:t>jpu</w:t>
-            </w:r>
-            <w:proofErr w:type="spellEnd"/>
-            <w:r>
-              <w:rPr>
-                <w:b/>
-                <w:bCs/>
-                <w:u w:val="single"/>
-                <w:lang w:val="en-US"/>
-              </w:rPr>
-              <w:t>}</w:t>
+              <w:t>${jpu}</w:t>
             </w:r>
           </w:p>
           <w:p>

</xml_diff>